<commit_message>
Version Inicial del Proyecto Sociotecnológico
Subiendo el word de proyecto amelia
</commit_message>
<xml_diff>
--- a/Proyecto Amelia 4-1 (En desarrollo).docx
+++ b/Proyecto Amelia 4-1 (En desarrollo).docx
@@ -303,8 +303,6 @@
         </w:rPr>
         <w:t>DISEÑO E IMPLEMENTACIÓN DE UN SISTEMA DE GESTIÓN DE BASE DE DATOS CON RETROALIMENTACIÓN INFORMATIVA PARA LA U.E. AMELIA RÍOS.</w:t>
       </w:r>
-      <w:bookmarkStart w:id="1" w:name="_GoBack"/>
-      <w:bookmarkEnd w:id="1"/>
     </w:p>
     <w:p>
       <w:pPr>
@@ -1703,27 +1701,7 @@
           <w:sz w:val="24"/>
           <w:szCs w:val="24"/>
         </w:rPr>
-        <w:t xml:space="preserve">     Según Mario </w:t>
-      </w:r>
-      <w:proofErr w:type="spellStart"/>
-      <w:r>
-        <w:rPr>
-          <w:rFonts w:ascii="Arial" w:hAnsi="Arial" w:cs="Arial"/>
-          <w:bCs/>
-          <w:sz w:val="24"/>
-          <w:szCs w:val="24"/>
-        </w:rPr>
-        <w:t>Róvere</w:t>
-      </w:r>
-      <w:proofErr w:type="spellEnd"/>
-      <w:r>
-        <w:rPr>
-          <w:rFonts w:ascii="Arial" w:hAnsi="Arial" w:cs="Arial"/>
-          <w:bCs/>
-          <w:sz w:val="24"/>
-          <w:szCs w:val="24"/>
-        </w:rPr>
-        <w:t xml:space="preserve"> (2010) “El diagnóstico situacional es la explicación de una realidad realizada por un actor social en función de los objetivos que persigue. En lugar de buscar una sola causa, propone el análisis de redes de problemas interconectados.</w:t>
+        <w:t xml:space="preserve">     Según Mario Róvere (2010) “El diagnóstico situacional es la explicación de una realidad realizada por un actor social en función de los objetivos que persigue. En lugar de buscar una sola causa, propone el análisis de redes de problemas interconectados.</w:t>
       </w:r>
       <w:r>
         <w:rPr>
@@ -2000,43 +1978,7 @@
           <w:sz w:val="24"/>
           <w:szCs w:val="24"/>
         </w:rPr>
-        <w:t xml:space="preserve">Según </w:t>
-      </w:r>
-      <w:proofErr w:type="spellStart"/>
-      <w:r>
-        <w:rPr>
-          <w:rFonts w:ascii="Arial" w:hAnsi="Arial" w:cs="Arial"/>
-          <w:sz w:val="24"/>
-          <w:szCs w:val="24"/>
-        </w:rPr>
-        <w:t>Creswell</w:t>
-      </w:r>
-      <w:proofErr w:type="spellEnd"/>
-      <w:r>
-        <w:rPr>
-          <w:rFonts w:ascii="Arial" w:hAnsi="Arial" w:cs="Arial"/>
-          <w:sz w:val="24"/>
-          <w:szCs w:val="24"/>
-        </w:rPr>
-        <w:t xml:space="preserve"> (2014) define la identificación del ámbito de estudio como el proceso de seleccionar un área de interés que es relevante y significativa para la investigación. Destaca la importancia de situar el estudio dentro del contexto existente y de formular preguntas que aborden vacíos en la literatura. La Unidad Educativa Estadal U.E.E Amelia Ríos es una escuela pública que ofrece una educación inicial y básica, está ubicada en la República Bolivariana de Venezuela, Municipio Maracaibo, Parroquia Cristo de Aranza del estado Zulia, específicamente sector La </w:t>
-      </w:r>
-      <w:proofErr w:type="spellStart"/>
-      <w:r>
-        <w:rPr>
-          <w:rFonts w:ascii="Arial" w:hAnsi="Arial" w:cs="Arial"/>
-          <w:sz w:val="24"/>
-          <w:szCs w:val="24"/>
-        </w:rPr>
-        <w:t>Arreaga</w:t>
-      </w:r>
-      <w:proofErr w:type="spellEnd"/>
-      <w:r>
-        <w:rPr>
-          <w:rFonts w:ascii="Arial" w:hAnsi="Arial" w:cs="Arial"/>
-          <w:sz w:val="24"/>
-          <w:szCs w:val="24"/>
-        </w:rPr>
-        <w:t>, Haticos por Abajo en la Avenida 17B N° 120 – 50.</w:t>
+        <w:t>Según Creswell (2014) define la identificación del ámbito de estudio como el proceso de seleccionar un área de interés que es relevante y significativa para la investigación. Destaca la importancia de situar el estudio dentro del contexto existente y de formular preguntas que aborden vacíos en la literatura. La Unidad Educativa Estadal U.E.E Amelia Ríos es una escuela pública que ofrece una educación inicial y básica, está ubicada en la República Bolivariana de Venezuela, Municipio Maracaibo, Parroquia Cristo de Aranza del estado Zulia, específicamente sector La Arreaga, Haticos por Abajo en la Avenida 17B N° 120 – 50.</w:t>
       </w:r>
     </w:p>
     <w:p>
@@ -2138,27 +2080,7 @@
           <w:sz w:val="24"/>
           <w:szCs w:val="24"/>
         </w:rPr>
-        <w:t xml:space="preserve">uente: Google </w:t>
-      </w:r>
-      <w:proofErr w:type="spellStart"/>
-      <w:r>
-        <w:rPr>
-          <w:rFonts w:ascii="Arial" w:hAnsi="Arial" w:cs="Arial"/>
-          <w:bCs/>
-          <w:sz w:val="24"/>
-          <w:szCs w:val="24"/>
-        </w:rPr>
-        <w:t>Maps</w:t>
-      </w:r>
-      <w:proofErr w:type="spellEnd"/>
-      <w:r>
-        <w:rPr>
-          <w:rFonts w:ascii="Arial" w:hAnsi="Arial" w:cs="Arial"/>
-          <w:bCs/>
-          <w:sz w:val="24"/>
-          <w:szCs w:val="24"/>
-        </w:rPr>
-        <w:t xml:space="preserve"> (2026</w:t>
+        <w:t>uente: Google Maps (2026</w:t>
       </w:r>
       <w:r>
         <w:rPr>
@@ -2328,27 +2250,7 @@
           <w:sz w:val="24"/>
           <w:szCs w:val="24"/>
         </w:rPr>
-        <w:t xml:space="preserve"> Revilla. En el año 1.960, fue fundada la Unidad Educativa Estadal “Amelia Ríos” epónimo de una excelente Maestra nacida en Maracaibo que se destacó por dedicar toda su vida a la Docencia, en sus inicios su director fue Aarón Revilla. Entre sus maestros fundadores estaban: Mtra. Olga Chacín, Ing. Josué Parra y Lic. Lino Ojeda; Posteriormente la institución fue trasladada a otro sitio, cerca de la prefectura, allí trabajaron los maestros Carmen de Fuenmayor, Eduardo Gonzales, Rubia de Peña, Alonso Andrade, Gladys de Zuleta, Mirta Rodríguez, </w:t>
-      </w:r>
-      <w:proofErr w:type="spellStart"/>
-      <w:r>
-        <w:rPr>
-          <w:rFonts w:ascii="Arial" w:hAnsi="Arial" w:cs="Arial"/>
-          <w:bCs/>
-          <w:sz w:val="24"/>
-          <w:szCs w:val="24"/>
-        </w:rPr>
-        <w:t>Sela</w:t>
-      </w:r>
-      <w:proofErr w:type="spellEnd"/>
-      <w:r>
-        <w:rPr>
-          <w:rFonts w:ascii="Arial" w:hAnsi="Arial" w:cs="Arial"/>
-          <w:bCs/>
-          <w:sz w:val="24"/>
-          <w:szCs w:val="24"/>
-        </w:rPr>
-        <w:t xml:space="preserve"> de Villalobos, Rosa Delgado y era dirigida por la señora María Urdaneta de Soto.</w:t>
+        <w:t xml:space="preserve"> Revilla. En el año 1.960, fue fundada la Unidad Educativa Estadal “Amelia Ríos” epónimo de una excelente Maestra nacida en Maracaibo que se destacó por dedicar toda su vida a la Docencia, en sus inicios su director fue Aarón Revilla. Entre sus maestros fundadores estaban: Mtra. Olga Chacín, Ing. Josué Parra y Lic. Lino Ojeda; Posteriormente la institución fue trasladada a otro sitio, cerca de la prefectura, allí trabajaron los maestros Carmen de Fuenmayor, Eduardo Gonzales, Rubia de Peña, Alonso Andrade, Gladys de Zuleta, Mirta Rodríguez, Sela de Villalobos, Rosa Delgado y era dirigida por la señora María Urdaneta de Soto.</w:t>
       </w:r>
       <w:r>
         <w:rPr>
@@ -2366,27 +2268,7 @@
           <w:sz w:val="24"/>
           <w:szCs w:val="24"/>
         </w:rPr>
-        <w:t xml:space="preserve">La Institución fue fundada en el año 1960 la matricula pasada es desconocida, ya que no cuentan con el registro pertinente, Desde sus inicios impartió enseñanzas desde pre escolar hasta 6to grado, en la actualidad esta escuela estadal cuenta con una matrícula estudiantil de 380 estudiantes, manteniéndose el esquema educativo desde inicial hasta 6to grado, actualmente esta institución está dirigida por la Lcda. </w:t>
-      </w:r>
-      <w:proofErr w:type="spellStart"/>
-      <w:r>
-        <w:rPr>
-          <w:rFonts w:ascii="Arial" w:hAnsi="Arial" w:cs="Arial"/>
-          <w:bCs/>
-          <w:sz w:val="24"/>
-          <w:szCs w:val="24"/>
-        </w:rPr>
-        <w:t>Nudith</w:t>
-      </w:r>
-      <w:proofErr w:type="spellEnd"/>
-      <w:r>
-        <w:rPr>
-          <w:rFonts w:ascii="Arial" w:hAnsi="Arial" w:cs="Arial"/>
-          <w:bCs/>
-          <w:sz w:val="24"/>
-          <w:szCs w:val="24"/>
-        </w:rPr>
-        <w:t xml:space="preserve"> Chirinos.</w:t>
+        <w:t>La Institución fue fundada en el año 1960 la matricula pasada es desconocida, ya que no cuentan con el registro pertinente, Desde sus inicios impartió enseñanzas desde pre escolar hasta 6to grado, en la actualidad esta escuela estadal cuenta con una matrícula estudiantil de 380 estudiantes, manteniéndose el esquema educativo desde inicial hasta 6to grado, actualmente esta institución está dirigida por la Lcda. Nudith Chirinos.</w:t>
       </w:r>
     </w:p>
     <w:p>
@@ -2587,61 +2469,7 @@
           <w:sz w:val="24"/>
           <w:szCs w:val="24"/>
         </w:rPr>
-        <w:t>en su obra “</w:t>
-      </w:r>
-      <w:proofErr w:type="spellStart"/>
-      <w:r>
-        <w:rPr>
-          <w:rFonts w:ascii="Arial" w:hAnsi="Arial" w:cs="Arial"/>
-          <w:sz w:val="24"/>
-          <w:szCs w:val="24"/>
-        </w:rPr>
-        <w:t>The</w:t>
-      </w:r>
-      <w:proofErr w:type="spellEnd"/>
-      <w:r>
-        <w:rPr>
-          <w:rFonts w:ascii="Arial" w:hAnsi="Arial" w:cs="Arial"/>
-          <w:sz w:val="24"/>
-          <w:szCs w:val="24"/>
-        </w:rPr>
-        <w:t xml:space="preserve"> </w:t>
-      </w:r>
-      <w:proofErr w:type="spellStart"/>
-      <w:r>
-        <w:rPr>
-          <w:rFonts w:ascii="Arial" w:hAnsi="Arial" w:cs="Arial"/>
-          <w:sz w:val="24"/>
-          <w:szCs w:val="24"/>
-        </w:rPr>
-        <w:t>Design</w:t>
-      </w:r>
-      <w:proofErr w:type="spellEnd"/>
-      <w:r>
-        <w:rPr>
-          <w:rFonts w:ascii="Arial" w:hAnsi="Arial" w:cs="Arial"/>
-          <w:sz w:val="24"/>
-          <w:szCs w:val="24"/>
-        </w:rPr>
-        <w:t xml:space="preserve"> of </w:t>
-      </w:r>
-      <w:proofErr w:type="spellStart"/>
-      <w:r>
-        <w:rPr>
-          <w:rFonts w:ascii="Arial" w:hAnsi="Arial" w:cs="Arial"/>
-          <w:sz w:val="24"/>
-          <w:szCs w:val="24"/>
-        </w:rPr>
-        <w:t>Everything</w:t>
-      </w:r>
-      <w:proofErr w:type="spellEnd"/>
-      <w:r>
-        <w:rPr>
-          <w:rFonts w:ascii="Arial" w:hAnsi="Arial" w:cs="Arial"/>
-          <w:sz w:val="24"/>
-          <w:szCs w:val="24"/>
-        </w:rPr>
-        <w:t xml:space="preserve">” </w:t>
+        <w:t xml:space="preserve">en su obra “The Design of Everything” </w:t>
       </w:r>
       <w:r>
         <w:rPr>
@@ -2665,51 +2493,15 @@
           <w:sz w:val="24"/>
           <w:szCs w:val="24"/>
         </w:rPr>
-        <w:t xml:space="preserve">r con herramientas como </w:t>
-      </w:r>
-      <w:proofErr w:type="gramStart"/>
-      <w:r>
-        <w:rPr>
-          <w:rFonts w:ascii="Arial" w:hAnsi="Arial" w:cs="Arial"/>
-          <w:sz w:val="24"/>
-          <w:szCs w:val="24"/>
-        </w:rPr>
-        <w:t>la matriz impacto</w:t>
-      </w:r>
-      <w:proofErr w:type="gramEnd"/>
-      <w:r>
-        <w:rPr>
-          <w:rFonts w:ascii="Arial" w:hAnsi="Arial" w:cs="Arial"/>
-          <w:sz w:val="24"/>
-          <w:szCs w:val="24"/>
-        </w:rPr>
-        <w:t xml:space="preserve">, </w:t>
-      </w:r>
-      <w:r>
-        <w:rPr>
-          <w:rFonts w:ascii="Arial" w:hAnsi="Arial" w:cs="Arial"/>
-          <w:sz w:val="24"/>
-          <w:szCs w:val="24"/>
-        </w:rPr>
-        <w:t xml:space="preserve">esfuerzo o el método </w:t>
-      </w:r>
-      <w:proofErr w:type="spellStart"/>
-      <w:r>
-        <w:rPr>
-          <w:rFonts w:ascii="Arial" w:hAnsi="Arial" w:cs="Arial"/>
-          <w:sz w:val="24"/>
-          <w:szCs w:val="24"/>
-        </w:rPr>
-        <w:t>MoSCoW</w:t>
-      </w:r>
-      <w:proofErr w:type="spellEnd"/>
-      <w:r>
-        <w:rPr>
-          <w:rFonts w:ascii="Arial" w:hAnsi="Arial" w:cs="Arial"/>
-          <w:sz w:val="24"/>
-          <w:szCs w:val="24"/>
-        </w:rPr>
-        <w:t>, se determina qué problemas abordar y con qué recursos. Bajo ésta premisa, se realizó un diagnóstico del equipo de investigadores que integró intereses, recursos y conflictos del personal adminis</w:t>
+        <w:t xml:space="preserve">r con herramientas como la matriz impacto, </w:t>
+      </w:r>
+      <w:r>
+        <w:rPr>
+          <w:rFonts w:ascii="Arial" w:hAnsi="Arial" w:cs="Arial"/>
+          <w:sz w:val="24"/>
+          <w:szCs w:val="24"/>
+        </w:rPr>
+        <w:t>esfuerzo o el método MoSCoW, se determina qué problemas abordar y con qué recursos. Bajo ésta premisa, se realizó un diagnóstico del equipo de investigadores que integró intereses, recursos y conflictos del personal adminis</w:t>
       </w:r>
       <w:r>
         <w:rPr>
@@ -3513,47 +3305,7 @@
           <w:sz w:val="24"/>
           <w:szCs w:val="24"/>
         </w:rPr>
-        <w:t xml:space="preserve">Concreta </w:t>
-      </w:r>
-      <w:proofErr w:type="spellStart"/>
-      <w:r>
-        <w:rPr>
-          <w:rFonts w:ascii="Arial" w:hAnsi="Arial" w:cs="Arial"/>
-          <w:bCs/>
-          <w:sz w:val="24"/>
-          <w:szCs w:val="24"/>
-        </w:rPr>
-        <w:t>Amartya</w:t>
-      </w:r>
-      <w:proofErr w:type="spellEnd"/>
-      <w:r>
-        <w:rPr>
-          <w:rFonts w:ascii="Arial" w:hAnsi="Arial" w:cs="Arial"/>
-          <w:bCs/>
-          <w:sz w:val="24"/>
-          <w:szCs w:val="24"/>
-        </w:rPr>
-        <w:t xml:space="preserve"> </w:t>
-      </w:r>
-      <w:proofErr w:type="spellStart"/>
-      <w:r>
-        <w:rPr>
-          <w:rFonts w:ascii="Arial" w:hAnsi="Arial" w:cs="Arial"/>
-          <w:bCs/>
-          <w:sz w:val="24"/>
-          <w:szCs w:val="24"/>
-        </w:rPr>
-        <w:t>Sen</w:t>
-      </w:r>
-      <w:proofErr w:type="spellEnd"/>
-      <w:r>
-        <w:rPr>
-          <w:rFonts w:ascii="Arial" w:hAnsi="Arial" w:cs="Arial"/>
-          <w:bCs/>
-          <w:sz w:val="24"/>
-          <w:szCs w:val="24"/>
-        </w:rPr>
-        <w:t xml:space="preserve"> (2009) </w:t>
+        <w:t xml:space="preserve">Concreta Amartya Sen (2009) </w:t>
       </w:r>
       <w:r>
         <w:rPr>
@@ -4127,27 +3879,7 @@
           <w:sz w:val="24"/>
           <w:szCs w:val="24"/>
         </w:rPr>
-        <w:t xml:space="preserve">Según Siddhartha Paul </w:t>
-      </w:r>
-      <w:proofErr w:type="spellStart"/>
-      <w:r>
-        <w:rPr>
-          <w:rFonts w:ascii="Arial" w:hAnsi="Arial" w:cs="Arial"/>
-          <w:bCs/>
-          <w:sz w:val="24"/>
-          <w:szCs w:val="24"/>
-        </w:rPr>
-        <w:t>Tiwari</w:t>
-      </w:r>
-      <w:proofErr w:type="spellEnd"/>
-      <w:r>
-        <w:rPr>
-          <w:rFonts w:ascii="Arial" w:hAnsi="Arial" w:cs="Arial"/>
-          <w:bCs/>
-          <w:sz w:val="24"/>
-          <w:szCs w:val="24"/>
-        </w:rPr>
-        <w:t xml:space="preserve"> (2023), en los proyectos socio-tecnológicos contemporáneos “el conocimiento profundo de cómo las prácticas sociales y los sistemas técnicos interactúan es fundamental para diagnosticar y diseñar soluciones tecnológicas efectivas”, lo cual implica incorporar la experiencia de los usuarios, la estructura organizacional y las herramientas tecnológicas en un marco integrador que permita contextualizar el problema y orientar la implementación de soluciones como sistemas de gestión de bases de datos dentro de un entorno institucional real.</w:t>
+        <w:t>Según Siddhartha Paul Tiwari (2023), en los proyectos socio-tecnológicos contemporáneos “el conocimiento profundo de cómo las prácticas sociales y los sistemas técnicos interactúan es fundamental para diagnosticar y diseñar soluciones tecnológicas efectivas”, lo cual implica incorporar la experiencia de los usuarios, la estructura organizacional y las herramientas tecnológicas en un marco integrador que permita contextualizar el problema y orientar la implementación de soluciones como sistemas de gestión de bases de datos dentro de un entorno institucional real.</w:t>
       </w:r>
     </w:p>
     <w:p>
@@ -5256,47 +4988,7 @@
           <w:sz w:val="24"/>
           <w:szCs w:val="24"/>
         </w:rPr>
-        <w:t xml:space="preserve">     Según </w:t>
-      </w:r>
-      <w:proofErr w:type="spellStart"/>
-      <w:r>
-        <w:rPr>
-          <w:rFonts w:ascii="Arial" w:hAnsi="Arial" w:cs="Arial"/>
-          <w:bCs/>
-          <w:sz w:val="24"/>
-          <w:szCs w:val="24"/>
-        </w:rPr>
-        <w:t>Jim</w:t>
-      </w:r>
-      <w:proofErr w:type="spellEnd"/>
-      <w:r>
-        <w:rPr>
-          <w:rFonts w:ascii="Arial" w:hAnsi="Arial" w:cs="Arial"/>
-          <w:bCs/>
-          <w:sz w:val="24"/>
-          <w:szCs w:val="24"/>
-        </w:rPr>
-        <w:t xml:space="preserve"> </w:t>
-      </w:r>
-      <w:proofErr w:type="spellStart"/>
-      <w:r>
-        <w:rPr>
-          <w:rFonts w:ascii="Arial" w:hAnsi="Arial" w:cs="Arial"/>
-          <w:bCs/>
-          <w:sz w:val="24"/>
-          <w:szCs w:val="24"/>
-        </w:rPr>
-        <w:t>Highsmith</w:t>
-      </w:r>
-      <w:proofErr w:type="spellEnd"/>
-      <w:r>
-        <w:rPr>
-          <w:rFonts w:ascii="Arial" w:hAnsi="Arial" w:cs="Arial"/>
-          <w:bCs/>
-          <w:sz w:val="24"/>
-          <w:szCs w:val="24"/>
-        </w:rPr>
-        <w:t xml:space="preserve"> (2004), </w:t>
+        <w:t xml:space="preserve">     Según Jim Highsmith (2004), </w:t>
       </w:r>
       <w:r>
         <w:rPr>
@@ -10187,18 +9879,8 @@
           <w:sz w:val="24"/>
           <w:szCs w:val="24"/>
         </w:rPr>
-        <w:t xml:space="preserve">Según </w:t>
-      </w:r>
-      <w:proofErr w:type="spellStart"/>
-      <w:r>
-        <w:rPr>
-          <w:rFonts w:ascii="Arial" w:hAnsi="Arial" w:cs="Arial"/>
-          <w:sz w:val="24"/>
-          <w:szCs w:val="24"/>
-        </w:rPr>
-        <w:t>Sommerville</w:t>
-      </w:r>
-      <w:proofErr w:type="spellEnd"/>
+        <w:t>Según Sommerville</w:t>
+      </w:r>
       <w:r>
         <w:rPr>
           <w:rFonts w:ascii="Arial" w:hAnsi="Arial" w:cs="Arial"/>
@@ -10416,56 +10098,16 @@
           <w:sz w:val="24"/>
           <w:szCs w:val="24"/>
         </w:rPr>
-        <w:t xml:space="preserve">Según Kenneth </w:t>
-      </w:r>
-      <w:proofErr w:type="spellStart"/>
-      <w:r>
-        <w:rPr>
-          <w:rFonts w:ascii="Arial" w:hAnsi="Arial" w:cs="Arial"/>
-          <w:bCs/>
-          <w:sz w:val="24"/>
-          <w:szCs w:val="24"/>
-        </w:rPr>
-        <w:t>Laudon</w:t>
-      </w:r>
-      <w:proofErr w:type="spellEnd"/>
-      <w:r>
-        <w:rPr>
-          <w:rFonts w:ascii="Arial" w:hAnsi="Arial" w:cs="Arial"/>
-          <w:bCs/>
-          <w:sz w:val="24"/>
-          <w:szCs w:val="24"/>
-        </w:rPr>
-        <w:t xml:space="preserve"> y Jane P. </w:t>
-      </w:r>
-      <w:proofErr w:type="spellStart"/>
-      <w:r>
-        <w:rPr>
-          <w:rFonts w:ascii="Arial" w:hAnsi="Arial" w:cs="Arial"/>
-          <w:bCs/>
-          <w:sz w:val="24"/>
-          <w:szCs w:val="24"/>
-        </w:rPr>
-        <w:t>L</w:t>
-      </w:r>
-      <w:r>
-        <w:rPr>
-          <w:rFonts w:ascii="Arial" w:hAnsi="Arial" w:cs="Arial"/>
-          <w:bCs/>
-          <w:sz w:val="24"/>
-          <w:szCs w:val="24"/>
-        </w:rPr>
-        <w:t>audon</w:t>
-      </w:r>
-      <w:proofErr w:type="spellEnd"/>
-      <w:r>
-        <w:rPr>
-          <w:rFonts w:ascii="Arial" w:hAnsi="Arial" w:cs="Arial"/>
-          <w:bCs/>
-          <w:sz w:val="24"/>
-          <w:szCs w:val="24"/>
-        </w:rPr>
-        <w:t xml:space="preserve"> (2016), “</w:t>
+        <w:t>Según Kenneth Laudon y Jane P. L</w:t>
+      </w:r>
+      <w:r>
+        <w:rPr>
+          <w:rFonts w:ascii="Arial" w:hAnsi="Arial" w:cs="Arial"/>
+          <w:bCs/>
+          <w:sz w:val="24"/>
+          <w:szCs w:val="24"/>
+        </w:rPr>
+        <w:t>audon (2016), “</w:t>
       </w:r>
       <w:r>
         <w:rPr>
@@ -10570,43 +10212,7 @@
           <w:sz w:val="24"/>
           <w:szCs w:val="24"/>
         </w:rPr>
-        <w:t xml:space="preserve">Según Kenneth C. </w:t>
-      </w:r>
-      <w:proofErr w:type="spellStart"/>
-      <w:r>
-        <w:rPr>
-          <w:rFonts w:ascii="Arial" w:hAnsi="Arial" w:cs="Arial"/>
-          <w:sz w:val="24"/>
-          <w:szCs w:val="24"/>
-        </w:rPr>
-        <w:t>Laudon</w:t>
-      </w:r>
-      <w:proofErr w:type="spellEnd"/>
-      <w:r>
-        <w:rPr>
-          <w:rFonts w:ascii="Arial" w:hAnsi="Arial" w:cs="Arial"/>
-          <w:sz w:val="24"/>
-          <w:szCs w:val="24"/>
-        </w:rPr>
-        <w:t xml:space="preserve"> y Jane P. </w:t>
-      </w:r>
-      <w:proofErr w:type="spellStart"/>
-      <w:r>
-        <w:rPr>
-          <w:rFonts w:ascii="Arial" w:hAnsi="Arial" w:cs="Arial"/>
-          <w:sz w:val="24"/>
-          <w:szCs w:val="24"/>
-        </w:rPr>
-        <w:t>Laudon</w:t>
-      </w:r>
-      <w:proofErr w:type="spellEnd"/>
-      <w:r>
-        <w:rPr>
-          <w:rFonts w:ascii="Arial" w:hAnsi="Arial" w:cs="Arial"/>
-          <w:sz w:val="24"/>
-          <w:szCs w:val="24"/>
-        </w:rPr>
-        <w:t xml:space="preserve"> (2016), </w:t>
+        <w:t xml:space="preserve">Según Kenneth C. Laudon y Jane P. Laudon (2016), </w:t>
       </w:r>
       <w:r>
         <w:rPr>
@@ -10646,25 +10252,7 @@
           <w:sz w:val="24"/>
           <w:szCs w:val="24"/>
         </w:rPr>
-        <w:t xml:space="preserve"> El grupo de investigadores </w:t>
-      </w:r>
-      <w:proofErr w:type="spellStart"/>
-      <w:r>
-        <w:rPr>
-          <w:rFonts w:ascii="Arial" w:hAnsi="Arial" w:cs="Arial"/>
-          <w:sz w:val="24"/>
-          <w:szCs w:val="24"/>
-        </w:rPr>
-        <w:t>a</w:t>
-      </w:r>
-      <w:proofErr w:type="spellEnd"/>
-      <w:r>
-        <w:rPr>
-          <w:rFonts w:ascii="Arial" w:hAnsi="Arial" w:cs="Arial"/>
-          <w:sz w:val="24"/>
-          <w:szCs w:val="24"/>
-        </w:rPr>
-        <w:t xml:space="preserve"> llegado a la conclusión que la forma de aplicar la teoría al presente proyecto toma en cuenta que el sistema centraliza datos a partir </w:t>
+        <w:t xml:space="preserve"> El grupo de investigadores a llegado a la conclusión que la forma de aplicar la teoría al presente proyecto toma en cuenta que el sistema centraliza datos a partir </w:t>
       </w:r>
       <w:r>
         <w:rPr>
@@ -10809,139 +10397,197 @@
         </w:rPr>
         <w:t xml:space="preserve">Según </w:t>
       </w:r>
-      <w:proofErr w:type="spellStart"/>
-      <w:r>
-        <w:rPr>
-          <w:rFonts w:ascii="Arial" w:hAnsi="Arial" w:cs="Arial"/>
-          <w:bCs/>
-          <w:sz w:val="24"/>
-          <w:szCs w:val="24"/>
-        </w:rPr>
-        <w:t>Jim</w:t>
-      </w:r>
-      <w:proofErr w:type="spellEnd"/>
-      <w:r>
-        <w:rPr>
-          <w:rFonts w:ascii="Arial" w:hAnsi="Arial" w:cs="Arial"/>
-          <w:bCs/>
+      <w:r>
+        <w:rPr>
+          <w:rFonts w:ascii="Arial" w:hAnsi="Arial" w:cs="Arial"/>
+          <w:bCs/>
+          <w:sz w:val="24"/>
+          <w:szCs w:val="24"/>
+        </w:rPr>
+        <w:t>Jim Highsmith (2004)</w:t>
+      </w:r>
+      <w:r>
+        <w:rPr>
+          <w:rFonts w:ascii="Arial" w:hAnsi="Arial" w:cs="Arial"/>
+          <w:bCs/>
+          <w:sz w:val="24"/>
+          <w:szCs w:val="24"/>
+        </w:rPr>
+        <w:t>, “</w:t>
+      </w:r>
+      <w:r>
+        <w:rPr>
+          <w:rFonts w:ascii="Arial" w:hAnsi="Arial" w:cs="Arial"/>
+          <w:bCs/>
+          <w:sz w:val="24"/>
+          <w:szCs w:val="24"/>
+        </w:rPr>
+        <w:t>El desarrollo de software debe gestionarse mediante planificación iterativa, adaptación continua y entregas funcionales progresivas</w:t>
+      </w:r>
+      <w:r>
+        <w:rPr>
+          <w:rFonts w:ascii="Arial" w:hAnsi="Arial" w:cs="Arial"/>
+          <w:bCs/>
+          <w:sz w:val="24"/>
+          <w:szCs w:val="24"/>
+        </w:rPr>
+        <w:t xml:space="preserve">”. Fortalecen la acción porque el sistema diseñado e implementado por el grupo de investigadores requiere planificación estructurada también se desarrolla por modulo esto abarcan noticias, eventos, galería </w:t>
+      </w:r>
+      <w:r>
+        <w:rPr>
+          <w:rFonts w:ascii="Arial" w:hAnsi="Arial" w:cs="Arial"/>
+          <w:bCs/>
+          <w:sz w:val="24"/>
+          <w:szCs w:val="24"/>
+        </w:rPr>
+        <w:t>etc. Y también pueden transformarse según las necesidades de la institución demuestra que la intervención tecnológica no es improvisada si no metodológicamente sustentada.</w:t>
+      </w:r>
+    </w:p>
+    <w:p>
+      <w:pPr>
+        <w:spacing w:line="259" w:lineRule="auto"/>
+        <w:rPr>
+          <w:rFonts w:ascii="Arial" w:hAnsi="Arial" w:cs="Arial"/>
+          <w:b/>
+          <w:sz w:val="24"/>
+          <w:szCs w:val="24"/>
+        </w:rPr>
+      </w:pPr>
+      <w:r>
+        <w:rPr>
+          <w:rFonts w:ascii="Arial" w:hAnsi="Arial" w:cs="Arial"/>
+          <w:b/>
+          <w:sz w:val="24"/>
+          <w:szCs w:val="24"/>
+        </w:rPr>
+        <w:t>Teoría de la C</w:t>
+      </w:r>
+      <w:r>
+        <w:rPr>
+          <w:rFonts w:ascii="Arial" w:hAnsi="Arial" w:cs="Arial"/>
+          <w:b/>
+          <w:sz w:val="24"/>
+          <w:szCs w:val="24"/>
+        </w:rPr>
+        <w:t>omu</w:t>
+      </w:r>
+      <w:r>
+        <w:rPr>
+          <w:rFonts w:ascii="Arial" w:hAnsi="Arial" w:cs="Arial"/>
+          <w:b/>
+          <w:sz w:val="24"/>
+          <w:szCs w:val="24"/>
+        </w:rPr>
+        <w:t>nicación O</w:t>
+      </w:r>
+      <w:r>
+        <w:rPr>
+          <w:rFonts w:ascii="Arial" w:hAnsi="Arial" w:cs="Arial"/>
+          <w:b/>
+          <w:sz w:val="24"/>
+          <w:szCs w:val="24"/>
+        </w:rPr>
+        <w:t>rganizacional</w:t>
+      </w:r>
+    </w:p>
+    <w:p>
+      <w:pPr>
+        <w:spacing w:line="360" w:lineRule="auto"/>
+        <w:rPr>
+          <w:rFonts w:ascii="Arial" w:hAnsi="Arial" w:cs="Arial"/>
+          <w:sz w:val="24"/>
+          <w:szCs w:val="24"/>
+        </w:rPr>
+      </w:pPr>
+      <w:r>
+        <w:rPr>
+          <w:rFonts w:ascii="Arial" w:hAnsi="Arial" w:cs="Arial"/>
+          <w:b/>
+          <w:sz w:val="24"/>
+          <w:szCs w:val="24"/>
+        </w:rPr>
+        <w:t xml:space="preserve">     </w:t>
+      </w:r>
+      <w:r>
+        <w:rPr>
+          <w:rFonts w:ascii="Arial" w:hAnsi="Arial" w:cs="Arial"/>
+          <w:sz w:val="24"/>
+          <w:szCs w:val="24"/>
+        </w:rPr>
+        <w:t xml:space="preserve">Según </w:t>
+      </w:r>
+      <w:r>
+        <w:rPr>
+          <w:rFonts w:ascii="Arial" w:hAnsi="Arial" w:cs="Arial"/>
+          <w:sz w:val="24"/>
+          <w:szCs w:val="24"/>
+        </w:rPr>
+        <w:t>Stephen P. Robbins (2013)</w:t>
+      </w:r>
+      <w:r>
+        <w:rPr>
+          <w:rFonts w:ascii="Arial" w:hAnsi="Arial" w:cs="Arial"/>
+          <w:sz w:val="24"/>
+          <w:szCs w:val="24"/>
+        </w:rPr>
+        <w:t>, “</w:t>
+      </w:r>
+      <w:r>
+        <w:rPr>
+          <w:rFonts w:ascii="Arial" w:hAnsi="Arial" w:cs="Arial"/>
+          <w:sz w:val="24"/>
+          <w:szCs w:val="24"/>
+        </w:rPr>
+        <w:t>La comunicación efectiva dentro de las organizaciones mejora la coordinación, reduce conflictos y fortalece la cultura institucional</w:t>
+      </w:r>
+      <w:r>
+        <w:rPr>
+          <w:rFonts w:ascii="Arial" w:hAnsi="Arial" w:cs="Arial"/>
+          <w:sz w:val="24"/>
+          <w:szCs w:val="24"/>
+        </w:rPr>
+        <w:t>”</w:t>
+      </w:r>
+      <w:r>
+        <w:rPr>
+          <w:rFonts w:ascii="Arial" w:hAnsi="Arial" w:cs="Arial"/>
+          <w:sz w:val="24"/>
+          <w:szCs w:val="24"/>
+        </w:rPr>
+        <w:t>.</w:t>
+      </w:r>
+      <w:r>
+        <w:rPr>
+          <w:rFonts w:ascii="Arial" w:hAnsi="Arial" w:cs="Arial"/>
+          <w:sz w:val="24"/>
+          <w:szCs w:val="24"/>
+        </w:rPr>
+        <w:t xml:space="preserve"> La aplicación directa en el proyecto se basa en la búsqueda de optimizar el flujo informativo que se mueve libremente a lo largo del sistema de gestión de base de datos, trata de conseguir la optimizacion de publicaciones oficiales de eventos a traves del panel integrado en el software implementado también trata de conseguir una difusión estructurado y retroalimentación informativa digital</w:t>
+      </w:r>
+      <w:r>
+        <w:rPr>
+          <w:rFonts w:ascii="Arial" w:hAnsi="Arial" w:cs="Arial"/>
+          <w:sz w:val="24"/>
+          <w:szCs w:val="24"/>
+        </w:rPr>
+        <w:t>,</w:t>
+      </w:r>
+      <w:r>
+        <w:rPr>
+          <w:rFonts w:ascii="Arial" w:hAnsi="Arial" w:cs="Arial"/>
           <w:sz w:val="24"/>
           <w:szCs w:val="24"/>
         </w:rPr>
         <w:t xml:space="preserve"> </w:t>
       </w:r>
-      <w:proofErr w:type="spellStart"/>
-      <w:r>
-        <w:rPr>
-          <w:rFonts w:ascii="Arial" w:hAnsi="Arial" w:cs="Arial"/>
-          <w:bCs/>
-          <w:sz w:val="24"/>
-          <w:szCs w:val="24"/>
-        </w:rPr>
-        <w:t>Highsmith</w:t>
-      </w:r>
-      <w:proofErr w:type="spellEnd"/>
-      <w:r>
-        <w:rPr>
-          <w:rFonts w:ascii="Arial" w:hAnsi="Arial" w:cs="Arial"/>
-          <w:bCs/>
-          <w:sz w:val="24"/>
-          <w:szCs w:val="24"/>
-        </w:rPr>
-        <w:t xml:space="preserve"> (2004)</w:t>
-      </w:r>
-      <w:r>
-        <w:rPr>
-          <w:rFonts w:ascii="Arial" w:hAnsi="Arial" w:cs="Arial"/>
-          <w:bCs/>
-          <w:sz w:val="24"/>
-          <w:szCs w:val="24"/>
-        </w:rPr>
-        <w:t>, “</w:t>
-      </w:r>
-      <w:r>
-        <w:rPr>
-          <w:rFonts w:ascii="Arial" w:hAnsi="Arial" w:cs="Arial"/>
-          <w:bCs/>
-          <w:sz w:val="24"/>
-          <w:szCs w:val="24"/>
-        </w:rPr>
-        <w:t>El desarrollo de software debe gestionarse mediante planificación iterativa, adaptación continua y entregas funcionales progresivas</w:t>
-      </w:r>
-      <w:r>
-        <w:rPr>
-          <w:rFonts w:ascii="Arial" w:hAnsi="Arial" w:cs="Arial"/>
-          <w:bCs/>
-          <w:sz w:val="24"/>
-          <w:szCs w:val="24"/>
-        </w:rPr>
-        <w:t xml:space="preserve">”. Fortalecen la acción porque el sistema diseñado e implementado por el grupo de investigadores requiere planificación estructurada también se desarrolla por modulo esto abarcan noticias, eventos, galería </w:t>
-      </w:r>
-      <w:r>
-        <w:rPr>
-          <w:rFonts w:ascii="Arial" w:hAnsi="Arial" w:cs="Arial"/>
-          <w:bCs/>
-          <w:sz w:val="24"/>
-          <w:szCs w:val="24"/>
-        </w:rPr>
-        <w:t>etc. Y también pueden transformarse según las necesidades de la institución demuestra que la intervención tecnológica no es improvisada si no metodológicamente sustentada.</w:t>
-      </w:r>
-    </w:p>
-    <w:p>
-      <w:pPr>
-        <w:spacing w:line="259" w:lineRule="auto"/>
-        <w:rPr>
-          <w:rFonts w:ascii="Arial" w:hAnsi="Arial" w:cs="Arial"/>
-          <w:b/>
-          <w:sz w:val="24"/>
-          <w:szCs w:val="24"/>
-        </w:rPr>
-      </w:pPr>
-      <w:r>
-        <w:rPr>
-          <w:rFonts w:ascii="Arial" w:hAnsi="Arial" w:cs="Arial"/>
-          <w:b/>
-          <w:sz w:val="24"/>
-          <w:szCs w:val="24"/>
-        </w:rPr>
-        <w:t>Teoría de la C</w:t>
-      </w:r>
-      <w:r>
-        <w:rPr>
-          <w:rFonts w:ascii="Arial" w:hAnsi="Arial" w:cs="Arial"/>
-          <w:b/>
-          <w:sz w:val="24"/>
-          <w:szCs w:val="24"/>
-        </w:rPr>
-        <w:t>omu</w:t>
-      </w:r>
-      <w:r>
-        <w:rPr>
-          <w:rFonts w:ascii="Arial" w:hAnsi="Arial" w:cs="Arial"/>
-          <w:b/>
-          <w:sz w:val="24"/>
-          <w:szCs w:val="24"/>
-        </w:rPr>
-        <w:t>nicación O</w:t>
-      </w:r>
-      <w:r>
-        <w:rPr>
-          <w:rFonts w:ascii="Arial" w:hAnsi="Arial" w:cs="Arial"/>
-          <w:b/>
-          <w:sz w:val="24"/>
-          <w:szCs w:val="24"/>
-        </w:rPr>
-        <w:t>rganizacional</w:t>
-      </w:r>
-    </w:p>
-    <w:p>
-      <w:pPr>
-        <w:spacing w:line="360" w:lineRule="auto"/>
-        <w:rPr>
-          <w:rFonts w:ascii="Arial" w:hAnsi="Arial" w:cs="Arial"/>
-          <w:sz w:val="24"/>
-          <w:szCs w:val="24"/>
-        </w:rPr>
-      </w:pPr>
+      <w:r>
+        <w:rPr>
+          <w:rFonts w:ascii="Arial" w:hAnsi="Arial" w:cs="Arial"/>
+          <w:sz w:val="24"/>
+          <w:szCs w:val="24"/>
+        </w:rPr>
+        <w:t>de esta manera la teoría respalda el impacto social del sistema implementado</w:t>
+      </w:r>
       <w:r>
         <w:rPr>
           <w:rFonts w:ascii="Arial" w:hAnsi="Arial" w:cs="Arial"/>
@@ -10951,252 +10597,69 @@
         </w:rPr>
         <w:t xml:space="preserve">     </w:t>
       </w:r>
-      <w:r>
-        <w:rPr>
-          <w:rFonts w:ascii="Arial" w:hAnsi="Arial" w:cs="Arial"/>
-          <w:sz w:val="24"/>
-          <w:szCs w:val="24"/>
-        </w:rPr>
-        <w:t xml:space="preserve">Según </w:t>
-      </w:r>
-      <w:r>
-        <w:rPr>
-          <w:rFonts w:ascii="Arial" w:hAnsi="Arial" w:cs="Arial"/>
-          <w:sz w:val="24"/>
-          <w:szCs w:val="24"/>
-        </w:rPr>
-        <w:t xml:space="preserve">Stephen P. </w:t>
-      </w:r>
-      <w:proofErr w:type="spellStart"/>
-      <w:r>
-        <w:rPr>
-          <w:rFonts w:ascii="Arial" w:hAnsi="Arial" w:cs="Arial"/>
-          <w:sz w:val="24"/>
-          <w:szCs w:val="24"/>
-        </w:rPr>
-        <w:t>Robbins</w:t>
-      </w:r>
-      <w:proofErr w:type="spellEnd"/>
-      <w:r>
-        <w:rPr>
-          <w:rFonts w:ascii="Arial" w:hAnsi="Arial" w:cs="Arial"/>
-          <w:sz w:val="24"/>
-          <w:szCs w:val="24"/>
-        </w:rPr>
-        <w:t xml:space="preserve"> (2013)</w:t>
-      </w:r>
-      <w:r>
-        <w:rPr>
-          <w:rFonts w:ascii="Arial" w:hAnsi="Arial" w:cs="Arial"/>
-          <w:sz w:val="24"/>
-          <w:szCs w:val="24"/>
-        </w:rPr>
-        <w:t>, “</w:t>
-      </w:r>
-      <w:r>
-        <w:rPr>
-          <w:rFonts w:ascii="Arial" w:hAnsi="Arial" w:cs="Arial"/>
-          <w:sz w:val="24"/>
-          <w:szCs w:val="24"/>
-        </w:rPr>
-        <w:t>La comunicación efectiva dentro de las organizaciones mejora la coordinación, reduce conflictos y fortalece la cultura institucional</w:t>
-      </w:r>
-      <w:r>
-        <w:rPr>
-          <w:rFonts w:ascii="Arial" w:hAnsi="Arial" w:cs="Arial"/>
-          <w:sz w:val="24"/>
-          <w:szCs w:val="24"/>
-        </w:rPr>
-        <w:t>”</w:t>
-      </w:r>
-      <w:r>
-        <w:rPr>
-          <w:rFonts w:ascii="Arial" w:hAnsi="Arial" w:cs="Arial"/>
-          <w:sz w:val="24"/>
-          <w:szCs w:val="24"/>
-        </w:rPr>
-        <w:t>.</w:t>
-      </w:r>
-      <w:r>
-        <w:rPr>
-          <w:rFonts w:ascii="Arial" w:hAnsi="Arial" w:cs="Arial"/>
-          <w:sz w:val="24"/>
-          <w:szCs w:val="24"/>
-        </w:rPr>
-        <w:t xml:space="preserve"> La aplicación directa en el proyecto se basa en la búsqueda de optimizar el flujo informativo que se mueve libremente a lo largo del sistema de gestión de base de datos, trata de conseguir la </w:t>
-      </w:r>
-      <w:proofErr w:type="spellStart"/>
-      <w:r>
-        <w:rPr>
-          <w:rFonts w:ascii="Arial" w:hAnsi="Arial" w:cs="Arial"/>
-          <w:sz w:val="24"/>
-          <w:szCs w:val="24"/>
-        </w:rPr>
-        <w:t>optimizacion</w:t>
-      </w:r>
-      <w:proofErr w:type="spellEnd"/>
-      <w:r>
-        <w:rPr>
-          <w:rFonts w:ascii="Arial" w:hAnsi="Arial" w:cs="Arial"/>
-          <w:sz w:val="24"/>
-          <w:szCs w:val="24"/>
-        </w:rPr>
-        <w:t xml:space="preserve"> de publicaciones oficiales de eventos a </w:t>
-      </w:r>
-      <w:proofErr w:type="spellStart"/>
-      <w:r>
-        <w:rPr>
-          <w:rFonts w:ascii="Arial" w:hAnsi="Arial" w:cs="Arial"/>
-          <w:sz w:val="24"/>
-          <w:szCs w:val="24"/>
-        </w:rPr>
-        <w:t>traves</w:t>
-      </w:r>
-      <w:proofErr w:type="spellEnd"/>
-      <w:r>
-        <w:rPr>
-          <w:rFonts w:ascii="Arial" w:hAnsi="Arial" w:cs="Arial"/>
-          <w:sz w:val="24"/>
-          <w:szCs w:val="24"/>
-        </w:rPr>
-        <w:t xml:space="preserve"> del panel integrado en el software implementado también trata de conseguir una difusión estructurado y retroalimentación informativa digital</w:t>
-      </w:r>
-      <w:r>
-        <w:rPr>
-          <w:rFonts w:ascii="Arial" w:hAnsi="Arial" w:cs="Arial"/>
-          <w:sz w:val="24"/>
-          <w:szCs w:val="24"/>
-        </w:rPr>
-        <w:t>,</w:t>
-      </w:r>
-      <w:r>
-        <w:rPr>
-          <w:rFonts w:ascii="Arial" w:hAnsi="Arial" w:cs="Arial"/>
-          <w:sz w:val="24"/>
-          <w:szCs w:val="24"/>
-        </w:rPr>
-        <w:t xml:space="preserve"> </w:t>
-      </w:r>
-      <w:r>
-        <w:rPr>
-          <w:rFonts w:ascii="Arial" w:hAnsi="Arial" w:cs="Arial"/>
-          <w:sz w:val="24"/>
-          <w:szCs w:val="24"/>
-        </w:rPr>
-        <w:t>de esta manera la teoría respalda el impacto social del sistema implementado</w:t>
-      </w:r>
-      <w:r>
-        <w:rPr>
-          <w:rFonts w:ascii="Arial" w:hAnsi="Arial" w:cs="Arial"/>
-          <w:b/>
+    </w:p>
+    <w:p>
+      <w:pPr>
+        <w:spacing w:line="360" w:lineRule="auto"/>
+        <w:jc w:val="both"/>
+        <w:rPr>
+          <w:rFonts w:ascii="Arial" w:hAnsi="Arial" w:cs="Arial"/>
+          <w:b/>
+          <w:bCs/>
+          <w:sz w:val="24"/>
+          <w:szCs w:val="24"/>
+        </w:rPr>
+      </w:pPr>
+      <w:r>
+        <w:rPr>
+          <w:rFonts w:ascii="Arial" w:hAnsi="Arial" w:cs="Arial"/>
+          <w:b/>
+          <w:bCs/>
+          <w:sz w:val="24"/>
+          <w:szCs w:val="24"/>
+        </w:rPr>
+        <w:t>S</w:t>
+      </w:r>
+      <w:r>
+        <w:rPr>
+          <w:rFonts w:ascii="Arial" w:hAnsi="Arial" w:cs="Arial"/>
+          <w:b/>
+          <w:bCs/>
+          <w:sz w:val="24"/>
+          <w:szCs w:val="24"/>
+        </w:rPr>
+        <w:t>istema de información</w:t>
+      </w:r>
+    </w:p>
+    <w:p>
+      <w:pPr>
+        <w:spacing w:line="360" w:lineRule="auto"/>
+        <w:jc w:val="both"/>
+        <w:rPr>
+          <w:rFonts w:ascii="Arial" w:hAnsi="Arial" w:cs="Arial"/>
+          <w:bCs/>
+          <w:sz w:val="24"/>
+          <w:szCs w:val="24"/>
+        </w:rPr>
+      </w:pPr>
+      <w:r>
+        <w:rPr>
+          <w:rFonts w:ascii="Arial" w:hAnsi="Arial" w:cs="Arial"/>
+          <w:b/>
+          <w:bCs/>
           <w:sz w:val="24"/>
           <w:szCs w:val="24"/>
         </w:rPr>
         <w:t xml:space="preserve">     </w:t>
       </w:r>
-    </w:p>
-    <w:p>
-      <w:pPr>
-        <w:spacing w:line="360" w:lineRule="auto"/>
-        <w:jc w:val="both"/>
-        <w:rPr>
-          <w:rFonts w:ascii="Arial" w:hAnsi="Arial" w:cs="Arial"/>
-          <w:b/>
-          <w:bCs/>
-          <w:sz w:val="24"/>
-          <w:szCs w:val="24"/>
-        </w:rPr>
-      </w:pPr>
-      <w:r>
-        <w:rPr>
-          <w:rFonts w:ascii="Arial" w:hAnsi="Arial" w:cs="Arial"/>
-          <w:b/>
-          <w:bCs/>
-          <w:sz w:val="24"/>
-          <w:szCs w:val="24"/>
-        </w:rPr>
-        <w:t>S</w:t>
-      </w:r>
-      <w:r>
-        <w:rPr>
-          <w:rFonts w:ascii="Arial" w:hAnsi="Arial" w:cs="Arial"/>
-          <w:b/>
-          <w:bCs/>
-          <w:sz w:val="24"/>
-          <w:szCs w:val="24"/>
-        </w:rPr>
-        <w:t>istema de información</w:t>
-      </w:r>
-    </w:p>
-    <w:p>
-      <w:pPr>
-        <w:spacing w:line="360" w:lineRule="auto"/>
-        <w:jc w:val="both"/>
-        <w:rPr>
-          <w:rFonts w:ascii="Arial" w:hAnsi="Arial" w:cs="Arial"/>
-          <w:bCs/>
-          <w:sz w:val="24"/>
-          <w:szCs w:val="24"/>
-        </w:rPr>
-      </w:pPr>
-      <w:r>
-        <w:rPr>
-          <w:rFonts w:ascii="Arial" w:hAnsi="Arial" w:cs="Arial"/>
-          <w:b/>
-          <w:bCs/>
-          <w:sz w:val="24"/>
-          <w:szCs w:val="24"/>
-        </w:rPr>
-        <w:t xml:space="preserve">     </w:t>
-      </w:r>
-      <w:r>
-        <w:rPr>
-          <w:rFonts w:ascii="Arial" w:hAnsi="Arial" w:cs="Arial"/>
-          <w:bCs/>
-          <w:sz w:val="24"/>
-          <w:szCs w:val="24"/>
-        </w:rPr>
-        <w:t xml:space="preserve">Según Kenneth C. </w:t>
-      </w:r>
-      <w:proofErr w:type="spellStart"/>
-      <w:r>
-        <w:rPr>
-          <w:rFonts w:ascii="Arial" w:hAnsi="Arial" w:cs="Arial"/>
-          <w:bCs/>
-          <w:sz w:val="24"/>
-          <w:szCs w:val="24"/>
-        </w:rPr>
-        <w:t>Laudon</w:t>
-      </w:r>
-      <w:proofErr w:type="spellEnd"/>
-      <w:r>
-        <w:rPr>
-          <w:rFonts w:ascii="Arial" w:hAnsi="Arial" w:cs="Arial"/>
-          <w:bCs/>
-          <w:sz w:val="24"/>
-          <w:szCs w:val="24"/>
-        </w:rPr>
-        <w:t xml:space="preserve"> y Jane P. </w:t>
-      </w:r>
-      <w:proofErr w:type="spellStart"/>
-      <w:r>
-        <w:rPr>
-          <w:rFonts w:ascii="Arial" w:hAnsi="Arial" w:cs="Arial"/>
-          <w:bCs/>
-          <w:sz w:val="24"/>
-          <w:szCs w:val="24"/>
-        </w:rPr>
-        <w:t>Laudon</w:t>
-      </w:r>
-      <w:proofErr w:type="spellEnd"/>
-      <w:r>
-        <w:rPr>
-          <w:rFonts w:ascii="Arial" w:hAnsi="Arial" w:cs="Arial"/>
-          <w:bCs/>
-          <w:sz w:val="24"/>
-          <w:szCs w:val="24"/>
-        </w:rPr>
-        <w:t xml:space="preserve"> (2016), “Un sistema de información es un conjunto de componentes interrelacionados que recolectan, procesan, almacenan y distribuyen información para apoyar la toma de decisiones y el control en una organización.”</w:t>
+      <w:r>
+        <w:rPr>
+          <w:rFonts w:ascii="Arial" w:hAnsi="Arial" w:cs="Arial"/>
+          <w:bCs/>
+          <w:sz w:val="24"/>
+          <w:szCs w:val="24"/>
+        </w:rPr>
+        <w:t>Según Kenneth C. Laudon y Jane P. Laudon (2016), “Un sistema de información es un conjunto de componentes interrelacionados que recolectan, procesan, almacenan y distribuyen información para apoyar la toma de decisiones y el control en una organización.”</w:t>
       </w:r>
       <w:r>
         <w:rPr>
@@ -11367,41 +10830,13 @@
         </w:rPr>
         <w:t xml:space="preserve">     Según </w:t>
       </w:r>
-      <w:proofErr w:type="spellStart"/>
-      <w:r>
-        <w:rPr>
-          <w:rFonts w:ascii="Arial" w:hAnsi="Arial" w:cs="Arial"/>
-          <w:sz w:val="24"/>
-          <w:szCs w:val="24"/>
-        </w:rPr>
-        <w:t>Jim</w:t>
-      </w:r>
-      <w:proofErr w:type="spellEnd"/>
-      <w:r>
-        <w:rPr>
-          <w:rFonts w:ascii="Arial" w:hAnsi="Arial" w:cs="Arial"/>
-          <w:sz w:val="24"/>
-          <w:szCs w:val="24"/>
-        </w:rPr>
-        <w:t xml:space="preserve"> </w:t>
-      </w:r>
-      <w:proofErr w:type="spellStart"/>
-      <w:r>
-        <w:rPr>
-          <w:rFonts w:ascii="Arial" w:hAnsi="Arial" w:cs="Arial"/>
-          <w:sz w:val="24"/>
-          <w:szCs w:val="24"/>
-        </w:rPr>
-        <w:t>Highsmith</w:t>
-      </w:r>
-      <w:proofErr w:type="spellEnd"/>
-      <w:r>
-        <w:rPr>
-          <w:rFonts w:ascii="Arial" w:hAnsi="Arial" w:cs="Arial"/>
-          <w:sz w:val="24"/>
-          <w:szCs w:val="24"/>
-        </w:rPr>
-        <w:t xml:space="preserve"> (2004)</w:t>
+      <w:r>
+        <w:rPr>
+          <w:rFonts w:ascii="Arial" w:hAnsi="Arial" w:cs="Arial"/>
+          <w:sz w:val="24"/>
+          <w:szCs w:val="24"/>
+        </w:rPr>
+        <w:t>Jim Highsmith (2004)</w:t>
       </w:r>
       <w:r>
         <w:rPr>
@@ -12135,6 +11570,17 @@
         </w:rPr>
         <w:t xml:space="preserve">     Antonio Latorre (2007), en este ámbito, se busca que la Investigación Acción facilite la reflexión y la mejora continua del proceso de enseñanza-aprendizaje. De la misma forma el grupo de investigadores recolecta datos acerca de la comunidad y su comunicación que carece de retroalimentación publicitaria, dándole una solución concreta y sostenible implementan un sitio web donde a menudo van a acceder al menos el ingeniero del aula virtual y la directora para darle seguimiento en conjunto con el grupo de investigadores.</w:t>
       </w:r>
+      <w:r>
+        <w:rPr>
+          <w:rFonts w:ascii="Arial" w:eastAsia="Calibri" w:hAnsi="Arial" w:cs="Times New Roman"/>
+          <w:bCs/>
+          <w:sz w:val="24"/>
+          <w:lang w:eastAsia="en-US"/>
+        </w:rPr>
+        <w:t>.</w:t>
+      </w:r>
+      <w:bookmarkStart w:id="1" w:name="_GoBack"/>
+      <w:bookmarkEnd w:id="1"/>
     </w:p>
     <w:p>
       <w:pPr>
@@ -12175,139 +11621,49 @@
           <w:sz w:val="24"/>
           <w:lang w:eastAsia="en-US"/>
         </w:rPr>
-        <w:t xml:space="preserve">     Según </w:t>
-      </w:r>
-      <w:proofErr w:type="spellStart"/>
-      <w:r>
+        <w:t xml:space="preserve">     Según Simon Sinek (2011) “Se destaca la importancia de identificar el propósito y el significado detrás del problema para encontrar soluciones efectivas. Sinek sostiene que la identificación del problema debe considerar: Entender el propósito y significado del problema, considerar las necesidades y perspectivas de las personas afectadas al problema y buscar soluciones que se ajusten al propósito y necesidades de las personas” Es un proceso iterativo que busca comprender a profundidad situaciones y necesidades de las personas involucradas y esto se sostiene con el grupo de investigadores identificando la desinformación proporcionada por falta de retroalimentación publicitaria dentro del plantel. </w:t>
+      </w:r>
+    </w:p>
+    <w:p>
+      <w:pPr>
+        <w:spacing w:line="360" w:lineRule="auto"/>
+        <w:contextualSpacing/>
         <w:rPr>
           <w:rFonts w:ascii="Arial" w:eastAsia="Calibri" w:hAnsi="Arial" w:cs="Times New Roman"/>
+          <w:b/>
+          <w:bCs/>
           <w:sz w:val="24"/>
           <w:lang w:eastAsia="en-US"/>
         </w:rPr>
-        <w:t>Simon</w:t>
-      </w:r>
-      <w:proofErr w:type="spellEnd"/>
+      </w:pPr>
       <w:r>
         <w:rPr>
           <w:rFonts w:ascii="Arial" w:eastAsia="Calibri" w:hAnsi="Arial" w:cs="Times New Roman"/>
+          <w:b/>
+          <w:bCs/>
           <w:sz w:val="24"/>
           <w:lang w:eastAsia="en-US"/>
         </w:rPr>
-        <w:t xml:space="preserve"> </w:t>
-      </w:r>
-      <w:proofErr w:type="spellStart"/>
-      <w:r>
+        <w:t>REVISIÓN DE LA LITERATURA</w:t>
+      </w:r>
+    </w:p>
+    <w:p>
+      <w:pPr>
+        <w:spacing w:line="360" w:lineRule="auto"/>
+        <w:jc w:val="both"/>
         <w:rPr>
           <w:rFonts w:ascii="Arial" w:eastAsia="Calibri" w:hAnsi="Arial" w:cs="Times New Roman"/>
           <w:sz w:val="24"/>
           <w:lang w:eastAsia="en-US"/>
         </w:rPr>
-        <w:t>Sinek</w:t>
-      </w:r>
-      <w:proofErr w:type="spellEnd"/>
+      </w:pPr>
       <w:r>
         <w:rPr>
           <w:rFonts w:ascii="Arial" w:eastAsia="Calibri" w:hAnsi="Arial" w:cs="Times New Roman"/>
           <w:sz w:val="24"/>
           <w:lang w:eastAsia="en-US"/>
         </w:rPr>
-        <w:t xml:space="preserve"> (2011) “Se destaca la importancia de identificar el propósito y el significado detrás del problema para encontrar soluciones efectivas. </w:t>
-      </w:r>
-      <w:proofErr w:type="spellStart"/>
-      <w:r>
-        <w:rPr>
-          <w:rFonts w:ascii="Arial" w:eastAsia="Calibri" w:hAnsi="Arial" w:cs="Times New Roman"/>
-          <w:sz w:val="24"/>
-          <w:lang w:eastAsia="en-US"/>
-        </w:rPr>
-        <w:t>Sinek</w:t>
-      </w:r>
-      <w:proofErr w:type="spellEnd"/>
-      <w:r>
-        <w:rPr>
-          <w:rFonts w:ascii="Arial" w:eastAsia="Calibri" w:hAnsi="Arial" w:cs="Times New Roman"/>
-          <w:sz w:val="24"/>
-          <w:lang w:eastAsia="en-US"/>
-        </w:rPr>
-        <w:t xml:space="preserve"> sostiene que la identificación del problema debe considerar: Entender el propósito y significado del problema, considerar las necesidades y perspectivas de las personas afectadas al problema y buscar soluciones que se ajusten al propósito y necesidades de las personas” Es un proceso iterativo que busca comprender a profundidad situaciones y necesidades de las personas involucradas y esto se sostiene con el grupo de investigadores identificando la desinformación proporcionada por falta de retroalimentación publicitaria dentro del plantel. </w:t>
-      </w:r>
-    </w:p>
-    <w:p>
-      <w:pPr>
-        <w:spacing w:line="360" w:lineRule="auto"/>
-        <w:contextualSpacing/>
-        <w:rPr>
-          <w:rFonts w:ascii="Arial" w:eastAsia="Calibri" w:hAnsi="Arial" w:cs="Times New Roman"/>
-          <w:b/>
-          <w:bCs/>
-          <w:sz w:val="24"/>
-          <w:lang w:eastAsia="en-US"/>
-        </w:rPr>
-      </w:pPr>
-      <w:r>
-        <w:rPr>
-          <w:rFonts w:ascii="Arial" w:eastAsia="Calibri" w:hAnsi="Arial" w:cs="Times New Roman"/>
-          <w:b/>
-          <w:bCs/>
-          <w:sz w:val="24"/>
-          <w:lang w:eastAsia="en-US"/>
-        </w:rPr>
-        <w:t>REVISIÓN DE LA LITERATURA</w:t>
-      </w:r>
-    </w:p>
-    <w:p>
-      <w:pPr>
-        <w:spacing w:line="360" w:lineRule="auto"/>
-        <w:jc w:val="both"/>
-        <w:rPr>
-          <w:rFonts w:ascii="Arial" w:eastAsia="Calibri" w:hAnsi="Arial" w:cs="Times New Roman"/>
-          <w:sz w:val="24"/>
-          <w:lang w:eastAsia="en-US"/>
-        </w:rPr>
-      </w:pPr>
-      <w:r>
-        <w:rPr>
-          <w:rFonts w:ascii="Arial" w:eastAsia="Calibri" w:hAnsi="Arial" w:cs="Times New Roman"/>
-          <w:sz w:val="24"/>
-          <w:lang w:eastAsia="en-US"/>
-        </w:rPr>
-        <w:t xml:space="preserve">     Según Andrew </w:t>
-      </w:r>
-      <w:proofErr w:type="spellStart"/>
-      <w:r>
-        <w:rPr>
-          <w:rFonts w:ascii="Arial" w:eastAsia="Calibri" w:hAnsi="Arial" w:cs="Times New Roman"/>
-          <w:sz w:val="24"/>
-          <w:lang w:eastAsia="en-US"/>
-        </w:rPr>
-        <w:t>McGill</w:t>
-      </w:r>
-      <w:proofErr w:type="spellEnd"/>
-      <w:r>
-        <w:rPr>
-          <w:rFonts w:ascii="Arial" w:eastAsia="Calibri" w:hAnsi="Arial" w:cs="Times New Roman"/>
-          <w:sz w:val="24"/>
-          <w:lang w:eastAsia="en-US"/>
-        </w:rPr>
-        <w:t xml:space="preserve"> (2000) “La revisión de la literatura se refiere a la búsqueda y análisis de estudios previos relacionado con un tema en específico. </w:t>
-      </w:r>
-      <w:proofErr w:type="spellStart"/>
-      <w:r>
-        <w:rPr>
-          <w:rFonts w:ascii="Arial" w:eastAsia="Calibri" w:hAnsi="Arial" w:cs="Times New Roman"/>
-          <w:sz w:val="24"/>
-          <w:lang w:eastAsia="en-US"/>
-        </w:rPr>
-        <w:t>McGill</w:t>
-      </w:r>
-      <w:proofErr w:type="spellEnd"/>
-      <w:r>
-        <w:rPr>
-          <w:rFonts w:ascii="Arial" w:eastAsia="Calibri" w:hAnsi="Arial" w:cs="Times New Roman"/>
-          <w:sz w:val="24"/>
-          <w:lang w:eastAsia="en-US"/>
-        </w:rPr>
-        <w:t xml:space="preserve"> destaca que en la revisión de literatura se implican objetivos como: Identificar y recopilar estudios previos relacionados con el tema de investigación, análisis crítico que evalúe los estudios encontrados que identifiquen patrones, tendencias y limitaciones, por ultimo combinar los resultados de los estudios para obtener una compresión más profunda del tema.” Esto define que la investigación </w:t>
+        <w:t xml:space="preserve">     Según Andrew McGill (2000) “La revisión de la literatura se refiere a la búsqueda y análisis de estudios previos relacionado con un tema en específico. McGill destaca que en la revisión de literatura se implican objetivos como: Identificar y recopilar estudios previos relacionados con el tema de investigación, análisis crítico que evalúe los estudios encontrados que identifiquen patrones, tendencias y limitaciones, por ultimo combinar los resultados de los estudios para obtener una compresión más profunda del tema.” Esto define que la investigación </w:t>
       </w:r>
       <w:r>
         <w:rPr>
@@ -12358,32 +11714,56 @@
           <w:sz w:val="24"/>
           <w:lang w:eastAsia="en-US"/>
         </w:rPr>
-        <w:t xml:space="preserve">     Según Gary </w:t>
-      </w:r>
-      <w:proofErr w:type="spellStart"/>
-      <w:r>
+        <w:t xml:space="preserve">     Según Gary Hamel (2000) “La Planificación se refiere al proceso de definir objetivos claros y específicos y de desarrollar estrategias para alcanzarlo” Esto se interconecta con objetivo principal que es diseñar e implementar un sitio web publicitario retroalimentativo que sea accesible, funcional y deductivo para toda la comunidad educativa. Esta conclusión surgió tras un análisis detallado dentro de los procesos de la comunicación, promoción y participación dentro de la institución, donde se identificó los recursos de un espacio digital que facilite la difusión de información institucional permitiendo la interacción directa con los usuarios y fortalezca el sentido de pertenencia.</w:t>
+      </w:r>
+    </w:p>
+    <w:p>
+      <w:pPr>
+        <w:spacing w:line="360" w:lineRule="auto"/>
+        <w:contextualSpacing/>
+        <w:jc w:val="both"/>
         <w:rPr>
           <w:rFonts w:ascii="Arial" w:eastAsia="Calibri" w:hAnsi="Arial" w:cs="Times New Roman"/>
+          <w:b/>
+          <w:bCs/>
           <w:sz w:val="24"/>
           <w:lang w:eastAsia="en-US"/>
         </w:rPr>
-        <w:t>Hamel</w:t>
-      </w:r>
-      <w:proofErr w:type="spellEnd"/>
+      </w:pPr>
       <w:r>
         <w:rPr>
           <w:rFonts w:ascii="Arial" w:eastAsia="Calibri" w:hAnsi="Arial" w:cs="Times New Roman"/>
+          <w:b/>
+          <w:bCs/>
           <w:sz w:val="24"/>
           <w:lang w:eastAsia="en-US"/>
         </w:rPr>
-        <w:t xml:space="preserve"> (2000) “La Planificación se refiere al proceso de definir objetivos claros y específicos y de desarrollar estrategias para alcanzarlo” Esto se interconecta con objetivo principal que es diseñar e implementar un sitio web publicitario retroalimentativo que sea accesible, funcional y deductivo para toda la comunidad educativa. Esta conclusión surgió tras un análisis detallado dentro de los procesos de la comunicación, promoción y participación dentro de la institución, donde se identificó los recursos de un espacio digital que facilite la difusión de información institucional permitiendo la interacción directa con los usuarios y fortalezca el sentido de pertenencia.</w:t>
+        <w:t>ACCIÓN</w:t>
+      </w:r>
+    </w:p>
+    <w:p>
+      <w:pPr>
+        <w:spacing w:line="360" w:lineRule="auto"/>
+        <w:jc w:val="both"/>
+        <w:rPr>
+          <w:rFonts w:ascii="Arial" w:eastAsia="Calibri" w:hAnsi="Arial" w:cs="Times New Roman"/>
+          <w:sz w:val="24"/>
+          <w:lang w:eastAsia="en-US"/>
+        </w:rPr>
+      </w:pPr>
+      <w:r>
+        <w:rPr>
+          <w:rFonts w:ascii="Arial" w:eastAsia="Calibri" w:hAnsi="Arial" w:cs="Times New Roman"/>
+          <w:sz w:val="24"/>
+          <w:lang w:eastAsia="en-US"/>
+        </w:rPr>
+        <w:t xml:space="preserve">     Según Roger Pressman (2005) “Destaca la importancia de la iteración y la mejora continua del desarrollo del software” Esto implica mucho tomar acción implementando soluciones y ejecutando estrategias en la iteración y mejora continua en el proceso de investigación y desarrollo. Esto influye con un enfoque efectivo para abordar problemas complejos para la mejora de procesos continuos que a la larga ofrezcan mejores resultados. </w:t>
       </w:r>
     </w:p>
     <w:p>
       <w:pPr>
         <w:spacing w:line="360" w:lineRule="auto"/>
         <w:contextualSpacing/>
-        <w:jc w:val="both"/>
         <w:rPr>
           <w:rFonts w:ascii="Arial" w:eastAsia="Calibri" w:hAnsi="Arial" w:cs="Times New Roman"/>
           <w:b/>
@@ -12400,12 +11780,13 @@
           <w:sz w:val="24"/>
           <w:lang w:eastAsia="en-US"/>
         </w:rPr>
-        <w:t>ACCIÓN</w:t>
-      </w:r>
-    </w:p>
-    <w:p>
-      <w:pPr>
-        <w:spacing w:line="360" w:lineRule="auto"/>
+        <w:t>OBSERVACIÓN</w:t>
+      </w:r>
+    </w:p>
+    <w:p>
+      <w:pPr>
+        <w:spacing w:line="360" w:lineRule="auto"/>
+        <w:contextualSpacing/>
         <w:jc w:val="both"/>
         <w:rPr>
           <w:rFonts w:ascii="Arial" w:eastAsia="Calibri" w:hAnsi="Arial" w:cs="Times New Roman"/>
@@ -12419,86 +11800,7 @@
           <w:sz w:val="24"/>
           <w:lang w:eastAsia="en-US"/>
         </w:rPr>
-        <w:t xml:space="preserve">     Según Roger </w:t>
-      </w:r>
-      <w:proofErr w:type="spellStart"/>
-      <w:r>
-        <w:rPr>
-          <w:rFonts w:ascii="Arial" w:eastAsia="Calibri" w:hAnsi="Arial" w:cs="Times New Roman"/>
-          <w:sz w:val="24"/>
-          <w:lang w:eastAsia="en-US"/>
-        </w:rPr>
-        <w:t>Pressman</w:t>
-      </w:r>
-      <w:proofErr w:type="spellEnd"/>
-      <w:r>
-        <w:rPr>
-          <w:rFonts w:ascii="Arial" w:eastAsia="Calibri" w:hAnsi="Arial" w:cs="Times New Roman"/>
-          <w:sz w:val="24"/>
-          <w:lang w:eastAsia="en-US"/>
-        </w:rPr>
-        <w:t xml:space="preserve"> (2005) “Destaca la importancia de la iteración y la mejora continua del desarrollo del software” Esto implica mucho tomar acción implementando soluciones y ejecutando estrategias en la iteración y mejora continua en el proceso de investigación y desarrollo. Esto influye con un enfoque efectivo para abordar problemas complejos para la mejora de procesos continuos que a la larga ofrezcan mejores resultados. </w:t>
-      </w:r>
-    </w:p>
-    <w:p>
-      <w:pPr>
-        <w:spacing w:line="360" w:lineRule="auto"/>
-        <w:contextualSpacing/>
-        <w:rPr>
-          <w:rFonts w:ascii="Arial" w:eastAsia="Calibri" w:hAnsi="Arial" w:cs="Times New Roman"/>
-          <w:b/>
-          <w:bCs/>
-          <w:sz w:val="24"/>
-          <w:lang w:eastAsia="en-US"/>
-        </w:rPr>
-      </w:pPr>
-      <w:r>
-        <w:rPr>
-          <w:rFonts w:ascii="Arial" w:eastAsia="Calibri" w:hAnsi="Arial" w:cs="Times New Roman"/>
-          <w:b/>
-          <w:bCs/>
-          <w:sz w:val="24"/>
-          <w:lang w:eastAsia="en-US"/>
-        </w:rPr>
-        <w:t>OBSERVACIÓN</w:t>
-      </w:r>
-    </w:p>
-    <w:p>
-      <w:pPr>
-        <w:spacing w:line="360" w:lineRule="auto"/>
-        <w:contextualSpacing/>
-        <w:jc w:val="both"/>
-        <w:rPr>
-          <w:rFonts w:ascii="Arial" w:eastAsia="Calibri" w:hAnsi="Arial" w:cs="Times New Roman"/>
-          <w:sz w:val="24"/>
-          <w:lang w:eastAsia="en-US"/>
-        </w:rPr>
-      </w:pPr>
-      <w:r>
-        <w:rPr>
-          <w:rFonts w:ascii="Arial" w:eastAsia="Calibri" w:hAnsi="Arial" w:cs="Times New Roman"/>
-          <w:sz w:val="24"/>
-          <w:lang w:eastAsia="en-US"/>
-        </w:rPr>
-        <w:t xml:space="preserve">     Según David </w:t>
-      </w:r>
-      <w:proofErr w:type="spellStart"/>
-      <w:r>
-        <w:rPr>
-          <w:rFonts w:ascii="Arial" w:eastAsia="Calibri" w:hAnsi="Arial" w:cs="Times New Roman"/>
-          <w:sz w:val="24"/>
-          <w:lang w:eastAsia="en-US"/>
-        </w:rPr>
-        <w:t>Silverman</w:t>
-      </w:r>
-      <w:proofErr w:type="spellEnd"/>
-      <w:r>
-        <w:rPr>
-          <w:rFonts w:ascii="Arial" w:eastAsia="Calibri" w:hAnsi="Arial" w:cs="Times New Roman"/>
-          <w:sz w:val="24"/>
-          <w:lang w:eastAsia="en-US"/>
-        </w:rPr>
-        <w:t xml:space="preserve"> (2011) “La observación entra dentro de los métodos cualitativos que ponen en marcha el proceso de observar y registrar sistemáticamente el comportamiento de los fenómenos en su contexto natural con el objetivo de recopilar datos ricos y detallados” Dicho esto, se implicó el grupo de investigadores surtiendo información acerca de la comunicación interna y publicidades del plantel realizando un análisis que llevó a cabo cada evaluación del nuevo sistema y se toma en cuenta cada dato de cualquier índole, para la valoración del impacto social al implementar la dirección web.</w:t>
+        <w:t xml:space="preserve">     Según David Silverman (2011) “La observación entra dentro de los métodos cualitativos que ponen en marcha el proceso de observar y registrar sistemáticamente el comportamiento de los fenómenos en su contexto natural con el objetivo de recopilar datos ricos y detallados” Dicho esto, se implicó el grupo de investigadores surtiendo información acerca de la comunicación interna y publicidades del plantel realizando un análisis que llevó a cabo cada evaluación del nuevo sistema y se toma en cuenta cada dato de cualquier índole, para la valoración del impacto social al implementar la dirección web.</w:t>
       </w:r>
     </w:p>
     <w:p>
@@ -12581,47 +11883,7 @@
           <w:szCs w:val="24"/>
           <w:lang w:eastAsia="es-VE"/>
         </w:rPr>
-        <w:t xml:space="preserve">     Según David </w:t>
-      </w:r>
-      <w:proofErr w:type="spellStart"/>
-      <w:r>
-        <w:rPr>
-          <w:rFonts w:ascii="Arial" w:eastAsia="Times New Roman" w:hAnsi="Arial" w:cs="Arial"/>
-          <w:sz w:val="24"/>
-          <w:szCs w:val="24"/>
-          <w:lang w:eastAsia="es-VE"/>
-        </w:rPr>
-        <w:t>Whyte</w:t>
-      </w:r>
-      <w:proofErr w:type="spellEnd"/>
-      <w:r>
-        <w:rPr>
-          <w:rFonts w:ascii="Arial" w:eastAsia="Times New Roman" w:hAnsi="Arial" w:cs="Arial"/>
-          <w:sz w:val="24"/>
-          <w:szCs w:val="24"/>
-          <w:lang w:eastAsia="es-VE"/>
-        </w:rPr>
-        <w:t xml:space="preserve"> (2006) “La Investigación-Acción Participativa se basa en la colaboración activa entre investigadores y participantes para </w:t>
-      </w:r>
-      <w:proofErr w:type="spellStart"/>
-      <w:r>
-        <w:rPr>
-          <w:rFonts w:ascii="Arial" w:eastAsia="Times New Roman" w:hAnsi="Arial" w:cs="Arial"/>
-          <w:sz w:val="24"/>
-          <w:szCs w:val="24"/>
-          <w:lang w:eastAsia="es-VE"/>
-        </w:rPr>
-        <w:t>co</w:t>
-      </w:r>
-      <w:proofErr w:type="spellEnd"/>
-      <w:r>
-        <w:rPr>
-          <w:rFonts w:ascii="Arial" w:eastAsia="Times New Roman" w:hAnsi="Arial" w:cs="Arial"/>
-          <w:sz w:val="24"/>
-          <w:szCs w:val="24"/>
-          <w:lang w:eastAsia="es-VE"/>
-        </w:rPr>
-        <w:t xml:space="preserve">-construir conocimientos y tomar acción para cambiar la situación” dicho esto, </w:t>
+        <w:t xml:space="preserve">     Según David Whyte (2006) “La Investigación-Acción Participativa se basa en la colaboración activa entre investigadores y participantes para co-construir conocimientos y tomar acción para cambiar la situación” dicho esto, </w:t>
       </w:r>
       <w:r>
         <w:rPr>
@@ -12739,10 +12001,13 @@
           <w:szCs w:val="24"/>
           <w:lang w:eastAsia="es-VE"/>
         </w:rPr>
-        <w:t xml:space="preserve">     Según David </w:t>
-      </w:r>
-      <w:proofErr w:type="spellStart"/>
-      <w:r>
+        <w:t xml:space="preserve">     Según David Coghlan (2001) “Define la investigación-acción como un enfoque colaborativo que busca resolver problemas prácticos mediante la participación activa de los involucrados en el proceso”. La fusión de la práctica con la investigación para conseguir información que mejore esa práctica, se le denomina metodología de investigación-acción. Cuenta con un plazo colaborativo para abordar problemas sociales, comunitarios, específicos y educativos, además es un proceso cíclico. </w:t>
+      </w:r>
+    </w:p>
+    <w:p>
+      <w:pPr>
+        <w:spacing w:after="0" w:line="360" w:lineRule="auto"/>
+        <w:jc w:val="both"/>
         <w:rPr>
           <w:rFonts w:ascii="Arial" w:eastAsia="Times New Roman" w:hAnsi="Arial" w:cs="Arial"/>
           <w:color w:val="000000"/>
@@ -12750,9 +12015,7 @@
           <w:szCs w:val="24"/>
           <w:lang w:eastAsia="es-VE"/>
         </w:rPr>
-        <w:t>Coghlan</w:t>
-      </w:r>
-      <w:proofErr w:type="spellEnd"/>
+      </w:pPr>
       <w:r>
         <w:rPr>
           <w:rFonts w:ascii="Arial" w:eastAsia="Times New Roman" w:hAnsi="Arial" w:cs="Arial"/>
@@ -12761,13 +12024,9 @@
           <w:szCs w:val="24"/>
           <w:lang w:eastAsia="es-VE"/>
         </w:rPr>
-        <w:t xml:space="preserve"> (2001) “Define la investigación-acción como un enfoque colaborativo que busca resolver problemas prácticos mediante la participación activa de los involucrados en el proceso”. La fusión de la práctica con la investigación para conseguir información que mejore esa práctica, se le denomina metodología de investigación-acción. Cuenta con un plazo colaborativo para abordar problemas sociales, comunitarios, específicos y educativos, además es un proceso cíclico. </w:t>
-      </w:r>
-    </w:p>
-    <w:p>
-      <w:pPr>
-        <w:spacing w:after="0" w:line="360" w:lineRule="auto"/>
-        <w:jc w:val="both"/>
+        <w:t xml:space="preserve">     Además, según Orlando Fals Borda (2008), Una de las características fundamentales de la IAP es la forma colectiva en que se </w:t>
+      </w:r>
+      <w:r>
         <w:rPr>
           <w:rFonts w:ascii="Arial" w:eastAsia="Times New Roman" w:hAnsi="Arial" w:cs="Arial"/>
           <w:color w:val="000000"/>
@@ -12775,8 +12034,14 @@
           <w:szCs w:val="24"/>
           <w:lang w:eastAsia="es-VE"/>
         </w:rPr>
-      </w:pPr>
-      <w:r>
+        <w:lastRenderedPageBreak/>
+        <w:t>produce y se colectiviza el conocimiento. No se trata de un conocimiento generado únicamente por el investigador externo, sino que surge de la interacción y reflexión conjunta con los actores sociales o las comunidades involucradas.</w:t>
+      </w:r>
+    </w:p>
+    <w:p>
+      <w:pPr>
+        <w:spacing w:after="0" w:line="360" w:lineRule="auto"/>
+        <w:jc w:val="both"/>
         <w:rPr>
           <w:rFonts w:ascii="Arial" w:eastAsia="Times New Roman" w:hAnsi="Arial" w:cs="Arial"/>
           <w:color w:val="000000"/>
@@ -12784,9 +12049,7 @@
           <w:szCs w:val="24"/>
           <w:lang w:eastAsia="es-VE"/>
         </w:rPr>
-        <w:t xml:space="preserve">     Además, según Orlando </w:t>
-      </w:r>
-      <w:proofErr w:type="spellStart"/>
+      </w:pPr>
       <w:r>
         <w:rPr>
           <w:rFonts w:ascii="Arial" w:eastAsia="Times New Roman" w:hAnsi="Arial" w:cs="Arial"/>
@@ -12795,74 +12058,7 @@
           <w:szCs w:val="24"/>
           <w:lang w:eastAsia="es-VE"/>
         </w:rPr>
-        <w:t>Fals</w:t>
-      </w:r>
-      <w:proofErr w:type="spellEnd"/>
-      <w:r>
-        <w:rPr>
-          <w:rFonts w:ascii="Arial" w:eastAsia="Times New Roman" w:hAnsi="Arial" w:cs="Arial"/>
-          <w:color w:val="000000"/>
-          <w:sz w:val="24"/>
-          <w:szCs w:val="24"/>
-          <w:lang w:eastAsia="es-VE"/>
-        </w:rPr>
-        <w:t xml:space="preserve"> Borda (2008), Una de las características fundamentales de la IAP es la forma colectiva en que se </w:t>
-      </w:r>
-      <w:r>
-        <w:rPr>
-          <w:rFonts w:ascii="Arial" w:eastAsia="Times New Roman" w:hAnsi="Arial" w:cs="Arial"/>
-          <w:color w:val="000000"/>
-          <w:sz w:val="24"/>
-          <w:szCs w:val="24"/>
-          <w:lang w:eastAsia="es-VE"/>
-        </w:rPr>
-        <w:lastRenderedPageBreak/>
-        <w:t>produce y se colectiviza el conocimiento. No se trata de un conocimiento generado únicamente por el investigador externo, sino que surge de la interacción y reflexión conjunta con los actores sociales o las comunidades involucradas.</w:t>
-      </w:r>
-    </w:p>
-    <w:p>
-      <w:pPr>
-        <w:spacing w:after="0" w:line="360" w:lineRule="auto"/>
-        <w:jc w:val="both"/>
-        <w:rPr>
-          <w:rFonts w:ascii="Arial" w:eastAsia="Times New Roman" w:hAnsi="Arial" w:cs="Arial"/>
-          <w:color w:val="000000"/>
-          <w:sz w:val="24"/>
-          <w:szCs w:val="24"/>
-          <w:lang w:eastAsia="es-VE"/>
-        </w:rPr>
-      </w:pPr>
-      <w:r>
-        <w:rPr>
-          <w:rFonts w:ascii="Arial" w:eastAsia="Times New Roman" w:hAnsi="Arial" w:cs="Arial"/>
-          <w:color w:val="000000"/>
-          <w:sz w:val="24"/>
-          <w:szCs w:val="24"/>
-          <w:lang w:eastAsia="es-VE"/>
-        </w:rPr>
-        <w:t xml:space="preserve">     Este modelo se basa en la idea de que el conocimiento se genera a través de la acción y la reflexión, permitiendo a los participantes no solo entender sus situaciones, sino también actuar sobre ellas para generar cambios significativos. La investigación-acción se caracteriza por un ciclo continuo de planificación, acción, observación y reflexión, lo que fomenta un aprendizaje constante y adaptativo. </w:t>
-      </w:r>
-      <w:proofErr w:type="spellStart"/>
-      <w:r>
-        <w:rPr>
-          <w:rFonts w:ascii="Arial" w:eastAsia="Times New Roman" w:hAnsi="Arial" w:cs="Arial"/>
-          <w:color w:val="000000"/>
-          <w:sz w:val="24"/>
-          <w:szCs w:val="24"/>
-          <w:lang w:eastAsia="es-VE"/>
-        </w:rPr>
-        <w:t>Coghlan</w:t>
-      </w:r>
-      <w:proofErr w:type="spellEnd"/>
-      <w:r>
-        <w:rPr>
-          <w:rFonts w:ascii="Arial" w:eastAsia="Times New Roman" w:hAnsi="Arial" w:cs="Arial"/>
-          <w:color w:val="000000"/>
-          <w:sz w:val="24"/>
-          <w:szCs w:val="24"/>
-          <w:lang w:eastAsia="es-VE"/>
-        </w:rPr>
-        <w:t xml:space="preserve"> destaca que este enfoque es particularmente útil en entornos organizacionales, donde la colaboración entre investigadores y miembros de la organización puede llevar a soluciones más efectivas y sostenibles.</w:t>
+        <w:t xml:space="preserve">     Este modelo se basa en la idea de que el conocimiento se genera a través de la acción y la reflexión, permitiendo a los participantes no solo entender sus situaciones, sino también actuar sobre ellas para generar cambios significativos. La investigación-acción se caracteriza por un ciclo continuo de planificación, acción, observación y reflexión, lo que fomenta un aprendizaje constante y adaptativo. Coghlan destaca que este enfoque es particularmente útil en entornos organizacionales, donde la colaboración entre investigadores y miembros de la organización puede llevar a soluciones más efectivas y sostenibles.</w:t>
       </w:r>
     </w:p>
     <w:p>
@@ -13669,19 +12865,16 @@
           <w:sz w:val="24"/>
           <w:lang w:val="es-ES" w:eastAsia="en-US"/>
         </w:rPr>
-        <w:t xml:space="preserve"> Intel </w:t>
-      </w:r>
-      <w:proofErr w:type="spellStart"/>
+        <w:t xml:space="preserve"> Intel Xeon 3.30 GHz, es el procesador estándar del laboratorio informático y es beneficioso porque le da un rendimiento y una fiabilidad excepcionales para el desarrollo de la web. La m</w:t>
+      </w:r>
       <w:r>
         <w:rPr>
           <w:rFonts w:ascii="Arial" w:eastAsia="Calibri" w:hAnsi="Arial" w:cs="Times New Roman"/>
-          <w:bCs/>
           <w:sz w:val="24"/>
           <w:lang w:val="es-ES" w:eastAsia="en-US"/>
         </w:rPr>
-        <w:t>Xeon</w:t>
-      </w:r>
-      <w:proofErr w:type="spellEnd"/>
+        <w:t>emoria RAM:</w:t>
+      </w:r>
       <w:r>
         <w:rPr>
           <w:rFonts w:ascii="Arial" w:eastAsia="Calibri" w:hAnsi="Arial" w:cs="Times New Roman"/>
@@ -13689,41 +12882,118 @@
           <w:sz w:val="24"/>
           <w:lang w:val="es-ES" w:eastAsia="en-US"/>
         </w:rPr>
-        <w:t xml:space="preserve"> 3.30 GHz, es el procesador estándar del laboratorio informático y es beneficioso porque le da un rendimiento y una fiabilidad excepcionales para el desarrollo de la web. La m</w:t>
+        <w:t xml:space="preserve"> 4 GB, eficiente para sistema operativo y varias aplicaciones, sin embargo, no se espera realizar múltiples actividades o tener muchos archivos abiertos que afecten el rendimiento, los componentes informáticos poseen un </w:t>
       </w:r>
       <w:r>
         <w:rPr>
           <w:rFonts w:ascii="Arial" w:eastAsia="Calibri" w:hAnsi="Arial" w:cs="Times New Roman"/>
           <w:sz w:val="24"/>
+          <w:lang w:eastAsia="en-US"/>
+        </w:rPr>
+        <w:t>almacenamiento:</w:t>
+      </w:r>
+      <w:r>
+        <w:rPr>
+          <w:rFonts w:ascii="Arial" w:eastAsia="Calibri" w:hAnsi="Arial" w:cs="Times New Roman"/>
+          <w:bCs/>
+          <w:sz w:val="24"/>
+          <w:lang w:eastAsia="en-US"/>
+        </w:rPr>
+        <w:t xml:space="preserve"> entre 250gb y 500gb, es eficiente para la actualización del sitio web reduciendo los tiempos de carga, almacenamiento en caché y en la nube ofreciendo redundancia y estabilidad, la c</w:t>
+      </w:r>
+      <w:r>
+        <w:rPr>
+          <w:rFonts w:ascii="Arial" w:eastAsia="Calibri" w:hAnsi="Arial" w:cs="Times New Roman"/>
+          <w:sz w:val="24"/>
+          <w:lang w:eastAsia="en-US"/>
+        </w:rPr>
+        <w:t>onexión a internet en el laboratorio cuenta con</w:t>
+      </w:r>
+      <w:r>
+        <w:rPr>
+          <w:rFonts w:ascii="Arial" w:eastAsia="Calibri" w:hAnsi="Arial" w:cs="Times New Roman"/>
+          <w:bCs/>
+          <w:sz w:val="24"/>
+          <w:lang w:eastAsia="en-US"/>
+        </w:rPr>
+        <w:t xml:space="preserve"> conexión fluida y sólida para no haber interrupciones al momento de navegar en el sitio web.</w:t>
+      </w:r>
+    </w:p>
+    <w:p>
+      <w:pPr>
+        <w:spacing w:line="360" w:lineRule="auto"/>
+        <w:jc w:val="both"/>
+        <w:rPr>
+          <w:rFonts w:ascii="Arial" w:eastAsia="Calibri" w:hAnsi="Arial" w:cs="Times New Roman"/>
+          <w:bCs/>
+          <w:sz w:val="24"/>
           <w:lang w:val="es-ES" w:eastAsia="en-US"/>
         </w:rPr>
-        <w:t>emoria RAM:</w:t>
-      </w:r>
+      </w:pPr>
       <w:r>
         <w:rPr>
           <w:rFonts w:ascii="Arial" w:eastAsia="Calibri" w:hAnsi="Arial" w:cs="Times New Roman"/>
           <w:bCs/>
           <w:sz w:val="24"/>
+          <w:lang w:eastAsia="en-US"/>
+        </w:rPr>
+        <w:t xml:space="preserve"> Contamos con el s</w:t>
+      </w:r>
+      <w:r>
+        <w:rPr>
+          <w:rFonts w:ascii="Arial" w:eastAsia="Calibri" w:hAnsi="Arial" w:cs="Times New Roman"/>
+          <w:sz w:val="24"/>
+          <w:lang w:eastAsia="en-US"/>
+        </w:rPr>
+        <w:t>istema operativo Windows 10 que</w:t>
+      </w:r>
+      <w:r>
+        <w:rPr>
+          <w:rFonts w:ascii="Arial" w:eastAsia="Calibri" w:hAnsi="Arial" w:cs="Times New Roman"/>
+          <w:bCs/>
+          <w:sz w:val="24"/>
+          <w:lang w:eastAsia="en-US"/>
+        </w:rPr>
+        <w:t xml:space="preserve"> mejora el funcionamiento del sistema para la instalación del programa. Estos recursos están óptimos para el soportar el sitio web. </w:t>
+      </w:r>
+      <w:r>
+        <w:rPr>
+          <w:rFonts w:ascii="Arial" w:eastAsia="Calibri" w:hAnsi="Arial" w:cs="Times New Roman"/>
+          <w:bCs/>
+          <w:sz w:val="24"/>
           <w:lang w:val="es-ES" w:eastAsia="en-US"/>
         </w:rPr>
-        <w:t xml:space="preserve"> 4 GB, eficiente para sistema operativo y varias aplicaciones, sin embargo, no se espera realizar múltiples actividades o tener muchos archivos abiertos que afecten el rendimiento, los componentes informáticos poseen un </w:t>
-      </w:r>
-      <w:r>
+        <w:t>La Unidad Educativa Estatal “Amelia Ríos”.</w:t>
+      </w:r>
+    </w:p>
+    <w:p>
+      <w:pPr>
+        <w:spacing w:line="360" w:lineRule="auto"/>
+        <w:jc w:val="both"/>
         <w:rPr>
           <w:rFonts w:ascii="Arial" w:eastAsia="Calibri" w:hAnsi="Arial" w:cs="Times New Roman"/>
+          <w:bCs/>
           <w:sz w:val="24"/>
           <w:lang w:eastAsia="en-US"/>
         </w:rPr>
-        <w:t>almacenamiento:</w:t>
-      </w:r>
+      </w:pPr>
       <w:r>
         <w:rPr>
           <w:rFonts w:ascii="Arial" w:eastAsia="Calibri" w:hAnsi="Arial" w:cs="Times New Roman"/>
           <w:bCs/>
           <w:sz w:val="24"/>
+          <w:lang w:val="es-ES" w:eastAsia="en-US"/>
+        </w:rPr>
+        <w:t xml:space="preserve">     En cuanto a recursos o herramientas para la implementación del sitio web </w:t>
+      </w:r>
+      <w:r>
+        <w:rPr>
+          <w:rFonts w:ascii="Arial" w:eastAsia="Calibri" w:hAnsi="Arial" w:cs="Times New Roman"/>
+          <w:bCs/>
+          <w:sz w:val="24"/>
           <w:lang w:eastAsia="en-US"/>
         </w:rPr>
-        <w:t xml:space="preserve"> entre 250gb y 500gb, es eficiente para la actualización del sitio web reduciendo los tiempos de carga, almacenamiento en caché y en la nube ofreciendo redundancia y estabilidad, la c</w:t>
+        <w:t>“</w:t>
       </w:r>
       <w:r>
         <w:rPr>
@@ -13731,7 +13001,7 @@
           <w:sz w:val="24"/>
           <w:lang w:eastAsia="en-US"/>
         </w:rPr>
-        <w:t>onexión a internet en el laboratorio cuenta con</w:t>
+        <w:t>Wordpress</w:t>
       </w:r>
       <w:r>
         <w:rPr>
@@ -13740,152 +13010,16 @@
           <w:sz w:val="24"/>
           <w:lang w:eastAsia="en-US"/>
         </w:rPr>
-        <w:t xml:space="preserve"> conexión fluida y sólida para no haber interrupciones al momento de navegar en el sitio web.</w:t>
-      </w:r>
-    </w:p>
-    <w:p>
-      <w:pPr>
-        <w:spacing w:line="360" w:lineRule="auto"/>
-        <w:jc w:val="both"/>
+        <w:t xml:space="preserve">”: es un sistema de código abierto que concede a los usuarios crear y administrar el sitio web de manera simple y sencilla. Facilitando publicaciones de su contenido con su interfaz intuitiva llevando a cabo la personalización del sitio mismo. </w:t>
+      </w:r>
+      <w:r>
         <w:rPr>
           <w:rFonts w:ascii="Arial" w:eastAsia="Calibri" w:hAnsi="Arial" w:cs="Times New Roman"/>
           <w:bCs/>
           <w:sz w:val="24"/>
           <w:lang w:val="es-ES" w:eastAsia="en-US"/>
         </w:rPr>
-      </w:pPr>
-      <w:r>
-        <w:rPr>
-          <w:rFonts w:ascii="Arial" w:eastAsia="Calibri" w:hAnsi="Arial" w:cs="Times New Roman"/>
-          <w:bCs/>
-          <w:sz w:val="24"/>
-          <w:lang w:eastAsia="en-US"/>
-        </w:rPr>
-        <w:t xml:space="preserve"> Contamos con el s</w:t>
-      </w:r>
-      <w:r>
-        <w:rPr>
-          <w:rFonts w:ascii="Arial" w:eastAsia="Calibri" w:hAnsi="Arial" w:cs="Times New Roman"/>
-          <w:sz w:val="24"/>
-          <w:lang w:eastAsia="en-US"/>
-        </w:rPr>
-        <w:t>istema operativo Windows 10 que</w:t>
-      </w:r>
-      <w:r>
-        <w:rPr>
-          <w:rFonts w:ascii="Arial" w:eastAsia="Calibri" w:hAnsi="Arial" w:cs="Times New Roman"/>
-          <w:bCs/>
-          <w:sz w:val="24"/>
-          <w:lang w:eastAsia="en-US"/>
-        </w:rPr>
-        <w:t xml:space="preserve"> mejora el funcionamiento del sistema para la instalación del programa. Estos recursos están óptimos para el soportar el sitio web. </w:t>
-      </w:r>
-      <w:r>
-        <w:rPr>
-          <w:rFonts w:ascii="Arial" w:eastAsia="Calibri" w:hAnsi="Arial" w:cs="Times New Roman"/>
-          <w:bCs/>
-          <w:sz w:val="24"/>
-          <w:lang w:val="es-ES" w:eastAsia="en-US"/>
-        </w:rPr>
-        <w:t>La Unidad Educativa Estatal “Amelia Ríos”.</w:t>
-      </w:r>
-    </w:p>
-    <w:p>
-      <w:pPr>
-        <w:spacing w:line="360" w:lineRule="auto"/>
-        <w:jc w:val="both"/>
-        <w:rPr>
-          <w:rFonts w:ascii="Arial" w:eastAsia="Calibri" w:hAnsi="Arial" w:cs="Times New Roman"/>
-          <w:bCs/>
-          <w:sz w:val="24"/>
-          <w:lang w:eastAsia="en-US"/>
-        </w:rPr>
-      </w:pPr>
-      <w:r>
-        <w:rPr>
-          <w:rFonts w:ascii="Arial" w:eastAsia="Calibri" w:hAnsi="Arial" w:cs="Times New Roman"/>
-          <w:bCs/>
-          <w:sz w:val="24"/>
-          <w:lang w:val="es-ES" w:eastAsia="en-US"/>
-        </w:rPr>
-        <w:t xml:space="preserve">     En cuanto a recursos o herramientas para la implementación del sitio web </w:t>
-      </w:r>
-      <w:r>
-        <w:rPr>
-          <w:rFonts w:ascii="Arial" w:eastAsia="Calibri" w:hAnsi="Arial" w:cs="Times New Roman"/>
-          <w:bCs/>
-          <w:sz w:val="24"/>
-          <w:lang w:eastAsia="en-US"/>
-        </w:rPr>
-        <w:t>“</w:t>
-      </w:r>
-      <w:proofErr w:type="spellStart"/>
-      <w:r>
-        <w:rPr>
-          <w:rFonts w:ascii="Arial" w:eastAsia="Calibri" w:hAnsi="Arial" w:cs="Times New Roman"/>
-          <w:sz w:val="24"/>
-          <w:lang w:eastAsia="en-US"/>
-        </w:rPr>
-        <w:t>Wordpress</w:t>
-      </w:r>
-      <w:proofErr w:type="spellEnd"/>
-      <w:r>
-        <w:rPr>
-          <w:rFonts w:ascii="Arial" w:eastAsia="Calibri" w:hAnsi="Arial" w:cs="Times New Roman"/>
-          <w:bCs/>
-          <w:sz w:val="24"/>
-          <w:lang w:eastAsia="en-US"/>
-        </w:rPr>
-        <w:t xml:space="preserve">”: es un sistema de código abierto que concede a los usuarios crear y administrar el sitio web de manera simple y sencilla. Facilitando publicaciones de su contenido con su interfaz intuitiva llevando a cabo la personalización del sitio mismo. </w:t>
-      </w:r>
-      <w:r>
-        <w:rPr>
-          <w:rFonts w:ascii="Arial" w:eastAsia="Calibri" w:hAnsi="Arial" w:cs="Times New Roman"/>
-          <w:bCs/>
-          <w:sz w:val="24"/>
-          <w:lang w:val="es-ES" w:eastAsia="en-US"/>
-        </w:rPr>
-        <w:t xml:space="preserve">Implementar una seguridad con SSL, copias de seguridad regulares y </w:t>
-      </w:r>
-      <w:proofErr w:type="spellStart"/>
-      <w:r>
-        <w:rPr>
-          <w:rFonts w:ascii="Arial" w:eastAsia="Calibri" w:hAnsi="Arial" w:cs="Times New Roman"/>
-          <w:bCs/>
-          <w:sz w:val="24"/>
-          <w:lang w:val="es-ES" w:eastAsia="en-US"/>
-        </w:rPr>
-        <w:t>plugins</w:t>
-      </w:r>
-      <w:proofErr w:type="spellEnd"/>
-      <w:r>
-        <w:rPr>
-          <w:rFonts w:ascii="Arial" w:eastAsia="Calibri" w:hAnsi="Arial" w:cs="Times New Roman"/>
-          <w:bCs/>
-          <w:sz w:val="24"/>
-          <w:lang w:val="es-ES" w:eastAsia="en-US"/>
-        </w:rPr>
-        <w:t xml:space="preserve"> de seguridad, </w:t>
-      </w:r>
-      <w:proofErr w:type="spellStart"/>
-      <w:r>
-        <w:rPr>
-          <w:rFonts w:ascii="Arial" w:eastAsia="Calibri" w:hAnsi="Arial" w:cs="Times New Roman"/>
-          <w:bCs/>
-          <w:sz w:val="24"/>
-          <w:lang w:val="es-ES" w:eastAsia="en-US"/>
-        </w:rPr>
-        <w:t>Canva</w:t>
-      </w:r>
-      <w:proofErr w:type="spellEnd"/>
-      <w:r>
-        <w:rPr>
-          <w:rFonts w:ascii="Arial" w:eastAsia="Calibri" w:hAnsi="Arial" w:cs="Times New Roman"/>
-          <w:bCs/>
-          <w:sz w:val="24"/>
-          <w:lang w:val="es-ES" w:eastAsia="en-US"/>
-        </w:rPr>
-        <w:t xml:space="preserve"> s</w:t>
+        <w:t>Implementar una seguridad con SSL, copias de seguridad regulares y plugins de seguridad, Canva s</w:t>
       </w:r>
       <w:r>
         <w:rPr>
@@ -14142,9 +13276,17 @@
           <w:szCs w:val="24"/>
           <w:lang w:eastAsia="es-VE"/>
         </w:rPr>
-        <w:t xml:space="preserve">Estudio Económico y </w:t>
-      </w:r>
-      <w:proofErr w:type="gramStart"/>
+        <w:t>Estudio Económico y Financiero</w:t>
+      </w:r>
+      <w:r>
+        <w:rPr>
+          <w:rFonts w:ascii="Arial" w:eastAsia="Calibri" w:hAnsi="Arial" w:cs="Times New Roman"/>
+          <w:bCs/>
+          <w:sz w:val="24"/>
+          <w:lang w:eastAsia="en-US"/>
+        </w:rPr>
+        <w:t>“</w:t>
+      </w:r>
       <w:r>
         <w:rPr>
           <w:rFonts w:ascii="Arial" w:eastAsia="Times New Roman" w:hAnsi="Arial" w:cs="Arial"/>
@@ -14152,84 +13294,16 @@
           <w:szCs w:val="24"/>
           <w:lang w:eastAsia="es-VE"/>
         </w:rPr>
-        <w:t>Financiero</w:t>
-      </w:r>
-      <w:r>
-        <w:rPr>
-          <w:rFonts w:ascii="Arial" w:eastAsia="Calibri" w:hAnsi="Arial" w:cs="Times New Roman"/>
-          <w:bCs/>
-          <w:sz w:val="24"/>
-          <w:lang w:eastAsia="en-US"/>
-        </w:rPr>
-        <w:t>“</w:t>
+        <w:t xml:space="preserve"> Analiza los costos de inversión (desarrollo de la web, dominio, hosting, mantenimiento), los costos operativos, los posibles beneficios (ahorro en impresiones, mejora de la comunicación, impacto positivo en la imagen institucional) y la rentabilidad del proyecto a largo plazo. </w:t>
       </w:r>
       <w:r>
         <w:rPr>
           <w:rFonts w:ascii="Arial" w:eastAsia="Times New Roman" w:hAnsi="Arial" w:cs="Arial"/>
           <w:sz w:val="24"/>
           <w:szCs w:val="24"/>
-          <w:lang w:eastAsia="es-VE"/>
-        </w:rPr>
-        <w:t xml:space="preserve"> Analiza</w:t>
-      </w:r>
-      <w:proofErr w:type="gramEnd"/>
-      <w:r>
-        <w:rPr>
-          <w:rFonts w:ascii="Arial" w:eastAsia="Times New Roman" w:hAnsi="Arial" w:cs="Arial"/>
-          <w:sz w:val="24"/>
-          <w:szCs w:val="24"/>
-          <w:lang w:eastAsia="es-VE"/>
-        </w:rPr>
-        <w:t xml:space="preserve"> los costos de inversión (desarrollo de la web, dominio, hosting, mantenimiento), los costos operativos, los posibles beneficios (ahorro en impresiones, mejora de la comunicación, impacto positivo en la imagen institucional) y la rentabilidad del proyecto a largo plazo. </w:t>
-      </w:r>
-      <w:r>
-        <w:rPr>
-          <w:rFonts w:ascii="Arial" w:eastAsia="Times New Roman" w:hAnsi="Arial" w:cs="Arial"/>
-          <w:sz w:val="24"/>
-          <w:szCs w:val="24"/>
           <w:lang w:val="es-ES" w:eastAsia="es-VE"/>
         </w:rPr>
-        <w:t xml:space="preserve">En este sentido, el grupo de investigadores ha trabajado en base a reducidos costos, ya que empleamos nuestros conocimientos adquiridos en clases para la implementación de la dirección web para la institución llegando al acuerdo que la localidad del sitio web y donde residirá la </w:t>
-      </w:r>
-      <w:proofErr w:type="spellStart"/>
-      <w:r>
-        <w:rPr>
-          <w:rFonts w:ascii="Arial" w:eastAsia="Times New Roman" w:hAnsi="Arial" w:cs="Arial"/>
-          <w:sz w:val="24"/>
-          <w:szCs w:val="24"/>
-          <w:lang w:val="es-ES" w:eastAsia="es-VE"/>
-        </w:rPr>
-        <w:t>pagina</w:t>
-      </w:r>
-      <w:proofErr w:type="spellEnd"/>
-      <w:r>
-        <w:rPr>
-          <w:rFonts w:ascii="Arial" w:eastAsia="Times New Roman" w:hAnsi="Arial" w:cs="Arial"/>
-          <w:sz w:val="24"/>
-          <w:szCs w:val="24"/>
-          <w:lang w:val="es-ES" w:eastAsia="es-VE"/>
-        </w:rPr>
-        <w:t xml:space="preserve"> física digitalmente </w:t>
-      </w:r>
-      <w:proofErr w:type="spellStart"/>
-      <w:r>
-        <w:rPr>
-          <w:rFonts w:ascii="Arial" w:eastAsia="Times New Roman" w:hAnsi="Arial" w:cs="Arial"/>
-          <w:sz w:val="24"/>
-          <w:szCs w:val="24"/>
-          <w:lang w:val="es-ES" w:eastAsia="es-VE"/>
-        </w:rPr>
-        <w:t>sera</w:t>
-      </w:r>
-      <w:proofErr w:type="spellEnd"/>
-      <w:r>
-        <w:rPr>
-          <w:rFonts w:ascii="Arial" w:eastAsia="Times New Roman" w:hAnsi="Arial" w:cs="Arial"/>
-          <w:sz w:val="24"/>
-          <w:szCs w:val="24"/>
-          <w:lang w:val="es-ES" w:eastAsia="es-VE"/>
-        </w:rPr>
-        <w:t xml:space="preserve"> saldada en un costo de $5 al mes para la estadía del sitio web al menos para el navegador Google.</w:t>
+        <w:t>En este sentido, el grupo de investigadores ha trabajado en base a reducidos costos, ya que empleamos nuestros conocimientos adquiridos en clases para la implementación de la dirección web para la institución llegando al acuerdo que la localidad del sitio web y donde residirá la pagina física digitalmente sera saldada en un costo de $5 al mes para la estadía del sitio web al menos para el navegador Google.</w:t>
       </w:r>
     </w:p>
     <w:p>
@@ -14313,7 +13387,6 @@
         </w:rPr>
         <w:t>(2010) el autor Baca Urbina (2010) E</w:t>
       </w:r>
-      <w:proofErr w:type="spellStart"/>
       <w:r>
         <w:rPr>
           <w:rFonts w:ascii="Arial" w:eastAsia="Calibri" w:hAnsi="Arial" w:cs="Times New Roman"/>
@@ -14321,19 +13394,35 @@
           <w:sz w:val="24"/>
           <w:lang w:eastAsia="en-US"/>
         </w:rPr>
-        <w:t>xamina</w:t>
-      </w:r>
-      <w:proofErr w:type="spellEnd"/>
+        <w:t xml:space="preserve">xamina el marco legal y normativo que rige el proyecto, incluyendo leyes de protección de datos, privacidad, propiedad intelectual del contenido, regulaciones educativas, etc. Es fundamental el ordenamiento interno y la operatividad optima para el manejo eficaz del personal en la institución educativa. </w:t>
+      </w:r>
       <w:r>
         <w:rPr>
           <w:rFonts w:ascii="Arial" w:eastAsia="Calibri" w:hAnsi="Arial" w:cs="Times New Roman"/>
           <w:bCs/>
           <w:sz w:val="24"/>
+          <w:lang w:val="es-ES" w:eastAsia="en-US"/>
+        </w:rPr>
+        <w:t>En este sentido el grupo de investigadores consideramos tomar en cuenta la</w:t>
+      </w:r>
+      <w:r>
+        <w:rPr>
+          <w:rFonts w:ascii="Arial" w:eastAsia="Calibri" w:hAnsi="Arial" w:cs="Times New Roman"/>
+          <w:bCs/>
+          <w:sz w:val="24"/>
           <w:lang w:eastAsia="en-US"/>
         </w:rPr>
-        <w:t xml:space="preserve"> el marco legal y normativo que rige el proyecto, incluyendo leyes de protección de datos, privacidad, propiedad intelectual del contenido, regulaciones educativas, etc. Es fundamental el ordenamiento interno y la operatividad </w:t>
-      </w:r>
-      <w:proofErr w:type="spellStart"/>
+        <w:t xml:space="preserve"> “</w:t>
+      </w:r>
+      <w:r>
+        <w:rPr>
+          <w:rFonts w:ascii="Arial" w:eastAsia="Times New Roman" w:hAnsi="Arial" w:cs="Arial"/>
+          <w:sz w:val="24"/>
+          <w:szCs w:val="24"/>
+          <w:lang w:eastAsia="es-VE"/>
+        </w:rPr>
+        <w:t>Ley De Derecho De Autor</w:t>
+      </w:r>
       <w:r>
         <w:rPr>
           <w:rFonts w:ascii="Arial" w:eastAsia="Calibri" w:hAnsi="Arial" w:cs="Times New Roman"/>
@@ -14341,9 +13430,79 @@
           <w:sz w:val="24"/>
           <w:lang w:eastAsia="en-US"/>
         </w:rPr>
-        <w:t>optima</w:t>
-      </w:r>
-      <w:proofErr w:type="spellEnd"/>
+        <w:t>”</w:t>
+      </w:r>
+      <w:r>
+        <w:rPr>
+          <w:rFonts w:ascii="Arial" w:eastAsia="Times New Roman" w:hAnsi="Arial" w:cs="Arial"/>
+          <w:b/>
+          <w:sz w:val="24"/>
+          <w:szCs w:val="24"/>
+          <w:lang w:eastAsia="es-VE"/>
+        </w:rPr>
+        <w:t xml:space="preserve"> </w:t>
+      </w:r>
+      <w:r>
+        <w:rPr>
+          <w:rFonts w:ascii="Arial" w:eastAsia="Times New Roman" w:hAnsi="Arial" w:cs="Arial"/>
+          <w:sz w:val="24"/>
+          <w:szCs w:val="24"/>
+          <w:lang w:eastAsia="es-VE"/>
+        </w:rPr>
+        <w:t>ya que</w:t>
+      </w:r>
+      <w:r>
+        <w:rPr>
+          <w:rFonts w:ascii="Arial" w:eastAsia="Times New Roman" w:hAnsi="Arial" w:cs="Arial"/>
+          <w:b/>
+          <w:sz w:val="24"/>
+          <w:szCs w:val="24"/>
+          <w:lang w:eastAsia="es-VE"/>
+        </w:rPr>
+        <w:t xml:space="preserve"> </w:t>
+      </w:r>
+      <w:r>
+        <w:rPr>
+          <w:rFonts w:ascii="Arial" w:eastAsia="Times New Roman" w:hAnsi="Arial" w:cs="Arial"/>
+          <w:sz w:val="24"/>
+          <w:szCs w:val="24"/>
+          <w:lang w:eastAsia="es-VE"/>
+        </w:rPr>
+        <w:t>e</w:t>
+      </w:r>
+      <w:r>
+        <w:rPr>
+          <w:rFonts w:ascii="Arial" w:eastAsia="Times New Roman" w:hAnsi="Arial" w:cs="Arial"/>
+          <w:bCs/>
+          <w:sz w:val="24"/>
+          <w:szCs w:val="24"/>
+          <w:lang w:eastAsia="es-VE"/>
+        </w:rPr>
+        <w:t>l software se considera una obra literaria, lo que significa que tanto el código fuente como el código del objeto están protegidos por derechos de autor.</w:t>
+      </w:r>
+    </w:p>
+    <w:p>
+      <w:pPr>
+        <w:spacing w:line="360" w:lineRule="auto"/>
+        <w:jc w:val="both"/>
+        <w:rPr>
+          <w:rFonts w:ascii="Arial" w:eastAsia="Times New Roman" w:hAnsi="Arial" w:cs="Arial"/>
+          <w:bCs/>
+          <w:sz w:val="24"/>
+          <w:szCs w:val="24"/>
+          <w:lang w:eastAsia="es-VE"/>
+        </w:rPr>
+      </w:pPr>
+      <w:r>
+        <w:rPr>
+          <w:rFonts w:ascii="Arial" w:eastAsia="Times New Roman" w:hAnsi="Arial" w:cs="Arial"/>
+          <w:bCs/>
+          <w:sz w:val="24"/>
+          <w:szCs w:val="24"/>
+          <w:lang w:val="es-ES" w:eastAsia="es-VE"/>
+        </w:rPr>
+        <w:t xml:space="preserve">     Además los autores pueden optar por licenciar su software bajo diferentes condiciones, permitiendo a otros usarlo bajo ciertas restricciones, es decir, también consideramos ese tipo de </w:t>
+      </w:r>
       <w:r>
         <w:rPr>
           <w:rFonts w:ascii="Arial" w:eastAsia="Calibri" w:hAnsi="Arial" w:cs="Times New Roman"/>
@@ -14351,16 +13510,36 @@
           <w:sz w:val="24"/>
           <w:lang w:eastAsia="en-US"/>
         </w:rPr>
-        <w:t xml:space="preserve"> para el manejo eficaz del personal en la institución educativa. </w:t>
+        <w:t>“L</w:t>
+      </w:r>
+      <w:r>
+        <w:rPr>
+          <w:rFonts w:ascii="Arial" w:eastAsia="Times New Roman" w:hAnsi="Arial" w:cs="Arial"/>
+          <w:bCs/>
+          <w:sz w:val="24"/>
+          <w:szCs w:val="24"/>
+          <w:lang w:val="es-ES" w:eastAsia="es-VE"/>
+        </w:rPr>
+        <w:t>icencias</w:t>
       </w:r>
       <w:r>
         <w:rPr>
           <w:rFonts w:ascii="Arial" w:eastAsia="Calibri" w:hAnsi="Arial" w:cs="Times New Roman"/>
           <w:bCs/>
           <w:sz w:val="24"/>
-          <w:lang w:val="es-ES" w:eastAsia="en-US"/>
-        </w:rPr>
-        <w:t>En este sentido el grupo de investigadores consideramos tomar en cuenta la</w:t>
+          <w:lang w:eastAsia="en-US"/>
+        </w:rPr>
+        <w:t>”</w:t>
+      </w:r>
+      <w:r>
+        <w:rPr>
+          <w:rFonts w:ascii="Arial" w:eastAsia="Times New Roman" w:hAnsi="Arial" w:cs="Arial"/>
+          <w:bCs/>
+          <w:sz w:val="24"/>
+          <w:szCs w:val="24"/>
+          <w:lang w:val="es-ES" w:eastAsia="es-VE"/>
+        </w:rPr>
+        <w:t xml:space="preserve"> factibles para la investigación, otro punto valido para la factibilidad legal son los </w:t>
       </w:r>
       <w:r>
         <w:rPr>
@@ -14369,16 +13548,55 @@
           <w:sz w:val="24"/>
           <w:lang w:eastAsia="en-US"/>
         </w:rPr>
-        <w:t xml:space="preserve"> “</w:t>
+        <w:t>“R</w:t>
       </w:r>
       <w:r>
         <w:rPr>
           <w:rFonts w:ascii="Arial" w:eastAsia="Times New Roman" w:hAnsi="Arial" w:cs="Arial"/>
+          <w:bCs/>
+          <w:sz w:val="24"/>
+          <w:szCs w:val="24"/>
+          <w:lang w:val="es-ES" w:eastAsia="es-VE"/>
+        </w:rPr>
+        <w:t>egistros</w:t>
+      </w:r>
+      <w:r>
+        <w:rPr>
+          <w:rFonts w:ascii="Arial" w:eastAsia="Calibri" w:hAnsi="Arial" w:cs="Times New Roman"/>
+          <w:bCs/>
+          <w:sz w:val="24"/>
+          <w:lang w:eastAsia="en-US"/>
+        </w:rPr>
+        <w:t>”</w:t>
+      </w:r>
+      <w:r>
+        <w:rPr>
+          <w:rFonts w:ascii="Arial" w:eastAsia="Times New Roman" w:hAnsi="Arial" w:cs="Arial"/>
+          <w:b/>
           <w:sz w:val="24"/>
           <w:szCs w:val="24"/>
           <w:lang w:eastAsia="es-VE"/>
         </w:rPr>
-        <w:t>Ley De Derecho De Autor</w:t>
+        <w:t xml:space="preserve"> </w:t>
+      </w:r>
+      <w:r>
+        <w:rPr>
+          <w:rFonts w:ascii="Arial" w:eastAsia="Times New Roman" w:hAnsi="Arial" w:cs="Arial"/>
+          <w:sz w:val="24"/>
+          <w:szCs w:val="24"/>
+          <w:lang w:eastAsia="es-VE"/>
+        </w:rPr>
+        <w:t>a</w:t>
+      </w:r>
+      <w:r>
+        <w:rPr>
+          <w:rFonts w:ascii="Arial" w:eastAsia="Times New Roman" w:hAnsi="Arial" w:cs="Arial"/>
+          <w:bCs/>
+          <w:sz w:val="24"/>
+          <w:szCs w:val="24"/>
+          <w:lang w:eastAsia="es-VE"/>
+        </w:rPr>
+        <w:t>unque la protección es automática, registrar el software y el contenido del sitio web en el</w:t>
       </w:r>
       <w:r>
         <w:rPr>
@@ -14387,218 +13605,17 @@
           <w:sz w:val="24"/>
           <w:lang w:eastAsia="en-US"/>
         </w:rPr>
-        <w:t>”</w:t>
+        <w:t>“</w:t>
       </w:r>
       <w:r>
         <w:rPr>
           <w:rFonts w:ascii="Arial" w:eastAsia="Times New Roman" w:hAnsi="Arial" w:cs="Arial"/>
-          <w:b/>
+          <w:bCs/>
           <w:sz w:val="24"/>
           <w:szCs w:val="24"/>
           <w:lang w:eastAsia="es-VE"/>
         </w:rPr>
-        <w:t xml:space="preserve"> </w:t>
-      </w:r>
-      <w:r>
-        <w:rPr>
-          <w:rFonts w:ascii="Arial" w:eastAsia="Times New Roman" w:hAnsi="Arial" w:cs="Arial"/>
-          <w:sz w:val="24"/>
-          <w:szCs w:val="24"/>
-          <w:lang w:eastAsia="es-VE"/>
-        </w:rPr>
-        <w:t>ya que</w:t>
-      </w:r>
-      <w:r>
-        <w:rPr>
-          <w:rFonts w:ascii="Arial" w:eastAsia="Times New Roman" w:hAnsi="Arial" w:cs="Arial"/>
-          <w:b/>
-          <w:sz w:val="24"/>
-          <w:szCs w:val="24"/>
-          <w:lang w:eastAsia="es-VE"/>
-        </w:rPr>
-        <w:t xml:space="preserve"> </w:t>
-      </w:r>
-      <w:r>
-        <w:rPr>
-          <w:rFonts w:ascii="Arial" w:eastAsia="Times New Roman" w:hAnsi="Arial" w:cs="Arial"/>
-          <w:sz w:val="24"/>
-          <w:szCs w:val="24"/>
-          <w:lang w:eastAsia="es-VE"/>
-        </w:rPr>
-        <w:t>e</w:t>
-      </w:r>
-      <w:r>
-        <w:rPr>
-          <w:rFonts w:ascii="Arial" w:eastAsia="Times New Roman" w:hAnsi="Arial" w:cs="Arial"/>
-          <w:bCs/>
-          <w:sz w:val="24"/>
-          <w:szCs w:val="24"/>
-          <w:lang w:eastAsia="es-VE"/>
-        </w:rPr>
-        <w:t>l software se considera una obra literaria, lo que significa que tanto el código fuente como el código del objeto están protegidos por derechos de autor.</w:t>
-      </w:r>
-    </w:p>
-    <w:p>
-      <w:pPr>
-        <w:spacing w:line="360" w:lineRule="auto"/>
-        <w:jc w:val="both"/>
-        <w:rPr>
-          <w:rFonts w:ascii="Arial" w:eastAsia="Times New Roman" w:hAnsi="Arial" w:cs="Arial"/>
-          <w:bCs/>
-          <w:sz w:val="24"/>
-          <w:szCs w:val="24"/>
-          <w:lang w:eastAsia="es-VE"/>
-        </w:rPr>
-      </w:pPr>
-      <w:r>
-        <w:rPr>
-          <w:rFonts w:ascii="Arial" w:eastAsia="Times New Roman" w:hAnsi="Arial" w:cs="Arial"/>
-          <w:bCs/>
-          <w:sz w:val="24"/>
-          <w:szCs w:val="24"/>
-          <w:lang w:val="es-ES" w:eastAsia="es-VE"/>
-        </w:rPr>
-        <w:t xml:space="preserve">     Además los autores pueden optar por licenciar su software bajo diferentes condiciones, permitiendo a otros usarlo bajo ciertas restricciones, es decir, también consideramos ese tipo de </w:t>
-      </w:r>
-      <w:r>
-        <w:rPr>
-          <w:rFonts w:ascii="Arial" w:eastAsia="Calibri" w:hAnsi="Arial" w:cs="Times New Roman"/>
-          <w:bCs/>
-          <w:sz w:val="24"/>
-          <w:lang w:eastAsia="en-US"/>
-        </w:rPr>
-        <w:t>“L</w:t>
-      </w:r>
-      <w:proofErr w:type="spellStart"/>
-      <w:r>
-        <w:rPr>
-          <w:rFonts w:ascii="Arial" w:eastAsia="Times New Roman" w:hAnsi="Arial" w:cs="Arial"/>
-          <w:bCs/>
-          <w:sz w:val="24"/>
-          <w:szCs w:val="24"/>
-          <w:lang w:val="es-ES" w:eastAsia="es-VE"/>
-        </w:rPr>
-        <w:t>icencias</w:t>
-      </w:r>
-      <w:proofErr w:type="spellEnd"/>
-      <w:r>
-        <w:rPr>
-          <w:rFonts w:ascii="Arial" w:eastAsia="Calibri" w:hAnsi="Arial" w:cs="Times New Roman"/>
-          <w:bCs/>
-          <w:sz w:val="24"/>
-          <w:lang w:eastAsia="en-US"/>
-        </w:rPr>
-        <w:t>”</w:t>
-      </w:r>
-      <w:r>
-        <w:rPr>
-          <w:rFonts w:ascii="Arial" w:eastAsia="Times New Roman" w:hAnsi="Arial" w:cs="Arial"/>
-          <w:bCs/>
-          <w:sz w:val="24"/>
-          <w:szCs w:val="24"/>
-          <w:lang w:val="es-ES" w:eastAsia="es-VE"/>
-        </w:rPr>
-        <w:t xml:space="preserve"> factibles para la investigación, otro punto valido para la factibilidad legal son los </w:t>
-      </w:r>
-      <w:r>
-        <w:rPr>
-          <w:rFonts w:ascii="Arial" w:eastAsia="Calibri" w:hAnsi="Arial" w:cs="Times New Roman"/>
-          <w:bCs/>
-          <w:sz w:val="24"/>
-          <w:lang w:eastAsia="en-US"/>
-        </w:rPr>
-        <w:t>“R</w:t>
-      </w:r>
-      <w:proofErr w:type="spellStart"/>
-      <w:r>
-        <w:rPr>
-          <w:rFonts w:ascii="Arial" w:eastAsia="Times New Roman" w:hAnsi="Arial" w:cs="Arial"/>
-          <w:bCs/>
-          <w:sz w:val="24"/>
-          <w:szCs w:val="24"/>
-          <w:lang w:val="es-ES" w:eastAsia="es-VE"/>
-        </w:rPr>
-        <w:t>egistros</w:t>
-      </w:r>
-      <w:proofErr w:type="spellEnd"/>
-      <w:r>
-        <w:rPr>
-          <w:rFonts w:ascii="Arial" w:eastAsia="Calibri" w:hAnsi="Arial" w:cs="Times New Roman"/>
-          <w:bCs/>
-          <w:sz w:val="24"/>
-          <w:lang w:eastAsia="en-US"/>
-        </w:rPr>
-        <w:t>”</w:t>
-      </w:r>
-      <w:r>
-        <w:rPr>
-          <w:rFonts w:ascii="Arial" w:eastAsia="Times New Roman" w:hAnsi="Arial" w:cs="Arial"/>
-          <w:b/>
-          <w:sz w:val="24"/>
-          <w:szCs w:val="24"/>
-          <w:lang w:eastAsia="es-VE"/>
-        </w:rPr>
-        <w:t xml:space="preserve"> </w:t>
-      </w:r>
-      <w:r>
-        <w:rPr>
-          <w:rFonts w:ascii="Arial" w:eastAsia="Times New Roman" w:hAnsi="Arial" w:cs="Arial"/>
-          <w:sz w:val="24"/>
-          <w:szCs w:val="24"/>
-          <w:lang w:eastAsia="es-VE"/>
-        </w:rPr>
-        <w:t>a</w:t>
-      </w:r>
-      <w:r>
-        <w:rPr>
-          <w:rFonts w:ascii="Arial" w:eastAsia="Times New Roman" w:hAnsi="Arial" w:cs="Arial"/>
-          <w:bCs/>
-          <w:sz w:val="24"/>
-          <w:szCs w:val="24"/>
-          <w:lang w:eastAsia="es-VE"/>
-        </w:rPr>
-        <w:t xml:space="preserve">unque la protección es automática, registrar el software y el contenido del sitio web en </w:t>
-      </w:r>
-      <w:proofErr w:type="gramStart"/>
-      <w:r>
-        <w:rPr>
-          <w:rFonts w:ascii="Arial" w:eastAsia="Times New Roman" w:hAnsi="Arial" w:cs="Arial"/>
-          <w:bCs/>
-          <w:sz w:val="24"/>
-          <w:szCs w:val="24"/>
-          <w:lang w:eastAsia="es-VE"/>
-        </w:rPr>
-        <w:t>el</w:t>
-      </w:r>
-      <w:r>
-        <w:rPr>
-          <w:rFonts w:ascii="Arial" w:eastAsia="Calibri" w:hAnsi="Arial" w:cs="Times New Roman"/>
-          <w:bCs/>
-          <w:sz w:val="24"/>
-          <w:lang w:eastAsia="en-US"/>
-        </w:rPr>
-        <w:t>“</w:t>
-      </w:r>
-      <w:r>
-        <w:rPr>
-          <w:rFonts w:ascii="Arial" w:eastAsia="Times New Roman" w:hAnsi="Arial" w:cs="Arial"/>
-          <w:bCs/>
-          <w:sz w:val="24"/>
-          <w:szCs w:val="24"/>
-          <w:lang w:eastAsia="es-VE"/>
-        </w:rPr>
-        <w:t xml:space="preserve"> Centro</w:t>
-      </w:r>
-      <w:proofErr w:type="gramEnd"/>
-      <w:r>
-        <w:rPr>
-          <w:rFonts w:ascii="Arial" w:eastAsia="Times New Roman" w:hAnsi="Arial" w:cs="Arial"/>
-          <w:bCs/>
-          <w:sz w:val="24"/>
-          <w:szCs w:val="24"/>
-          <w:lang w:eastAsia="es-VE"/>
-        </w:rPr>
-        <w:t xml:space="preserve"> Nacional de Derecho de Autor</w:t>
+        <w:t xml:space="preserve"> Centro Nacional de Derecho de Autor</w:t>
       </w:r>
       <w:r>
         <w:rPr>
@@ -14749,18 +13766,17 @@
           <w:szCs w:val="24"/>
           <w:lang w:eastAsia="es-VE"/>
         </w:rPr>
-        <w:t xml:space="preserve"> implica el sitio web destinado para la Unidad Educativa Estadal Amelia Ríos, ya que se trabajó en este proyecto basándose en la metodología científica de Hernández </w:t>
-      </w:r>
-      <w:proofErr w:type="spellStart"/>
+        <w:t xml:space="preserve"> implica el sitio web destinado para la Unidad Educativa Estadal Amelia Ríos, ya que se trabajó en este proyecto basándose en la metodología científica de Hernández Sampi</w:t>
+      </w:r>
       <w:r>
         <w:rPr>
           <w:rFonts w:ascii="Arial" w:eastAsia="Times New Roman" w:hAnsi="Arial" w:cs="Arial"/>
           <w:color w:val="000000"/>
           <w:sz w:val="24"/>
           <w:szCs w:val="24"/>
-          <w:lang w:eastAsia="es-VE"/>
-        </w:rPr>
-        <w:t>Sampi</w:t>
+          <w:lang w:val="es-ES" w:eastAsia="es-VE"/>
+        </w:rPr>
+        <w:t xml:space="preserve">eri (2003) En La “Metodologia De La Investigación” (2003). Este proceso se basa </w:t>
       </w:r>
       <w:r>
         <w:rPr>
@@ -14770,56 +13786,59 @@
           <w:szCs w:val="24"/>
           <w:lang w:val="es-ES" w:eastAsia="es-VE"/>
         </w:rPr>
-        <w:t>eri</w:t>
-      </w:r>
-      <w:proofErr w:type="spellEnd"/>
-      <w:r>
+        <w:lastRenderedPageBreak/>
+        <w:t>en una serie de etapas que hay que recorrer para obtener un conocimiento válido desde el punto de vista científico, llevando a cabo la evaluación y observación de fenómenos, estableciendo suposiciones o ideas que tienen fundamento sobre las bases de pruebas y análisis, dicho y hecho que se proponen nuevas observaciones y evaluaciones para esclarecer, modificar y fundamentar nuevas suposiciones e ideas, incluyendo generar otras.</w:t>
+      </w:r>
+    </w:p>
+    <w:p>
+      <w:pPr>
+        <w:spacing w:after="0" w:line="360" w:lineRule="auto"/>
+        <w:jc w:val="both"/>
         <w:rPr>
           <w:rFonts w:ascii="Arial" w:eastAsia="Times New Roman" w:hAnsi="Arial" w:cs="Arial"/>
           <w:color w:val="000000"/>
           <w:sz w:val="24"/>
           <w:szCs w:val="24"/>
-          <w:lang w:val="es-ES" w:eastAsia="es-VE"/>
-        </w:rPr>
-        <w:t xml:space="preserve"> (2003) En La “</w:t>
-      </w:r>
-      <w:proofErr w:type="spellStart"/>
+          <w:lang w:eastAsia="es-VE"/>
+        </w:rPr>
+      </w:pPr>
       <w:r>
         <w:rPr>
           <w:rFonts w:ascii="Arial" w:eastAsia="Times New Roman" w:hAnsi="Arial" w:cs="Arial"/>
           <w:color w:val="000000"/>
           <w:sz w:val="24"/>
           <w:szCs w:val="24"/>
-          <w:lang w:val="es-ES" w:eastAsia="es-VE"/>
-        </w:rPr>
-        <w:t>Metodologia</w:t>
-      </w:r>
-      <w:proofErr w:type="spellEnd"/>
-      <w:r>
+          <w:lang w:eastAsia="es-VE"/>
+        </w:rPr>
+        <w:t xml:space="preserve">      Esto implica una perspicacia que lleva a cabo un análisis cuidadoso y sistemático tomando decisiones más informadas, A partir de aquí se determina la creación de un sitio web institucional desde su planificación hasta su publicación, sobre todo porque es muy importante definir sus objetivos claros, desde la creación para la interfaz adecuada, diseñar una estructura visualmente agradable a la vista, realizar un contenido de calidad con respecto al público que va dirigido, optimizar el sitio para dispositivos móviles y muy importante que se realicen pruebas exhaustivas para el correcto funcionamiento de la página.</w:t>
+      </w:r>
+    </w:p>
+    <w:p>
+      <w:pPr>
+        <w:spacing w:line="360" w:lineRule="auto"/>
+        <w:jc w:val="both"/>
         <w:rPr>
           <w:rFonts w:ascii="Arial" w:eastAsia="Times New Roman" w:hAnsi="Arial" w:cs="Arial"/>
           <w:color w:val="000000"/>
           <w:sz w:val="24"/>
           <w:szCs w:val="24"/>
-          <w:lang w:val="es-ES" w:eastAsia="es-VE"/>
-        </w:rPr>
-        <w:t xml:space="preserve"> De La Investigación” (2003). Este proceso se basa </w:t>
-      </w:r>
+          <w:lang w:eastAsia="es-VE"/>
+        </w:rPr>
+      </w:pPr>
       <w:r>
         <w:rPr>
           <w:rFonts w:ascii="Arial" w:eastAsia="Times New Roman" w:hAnsi="Arial" w:cs="Arial"/>
           <w:color w:val="000000"/>
           <w:sz w:val="24"/>
           <w:szCs w:val="24"/>
-          <w:lang w:val="es-ES" w:eastAsia="es-VE"/>
-        </w:rPr>
-        <w:lastRenderedPageBreak/>
-        <w:t>en una serie de etapas que hay que recorrer para obtener un conocimiento válido desde el punto de vista científico, llevando a cabo la evaluación y observación de fenómenos, estableciendo suposiciones o ideas que tienen fundamento sobre las bases de pruebas y análisis, dicho y hecho que se proponen nuevas observaciones y evaluaciones para esclarecer, modificar y fundamentar nuevas suposiciones e ideas, incluyendo generar otras.</w:t>
-      </w:r>
-    </w:p>
-    <w:p>
-      <w:pPr>
-        <w:spacing w:after="0" w:line="360" w:lineRule="auto"/>
+          <w:lang w:eastAsia="es-VE"/>
+        </w:rPr>
+        <w:t xml:space="preserve">     El marco teórico según “Hernández Sampieri” (2003) “Es el sustento teórico del estudio. Implica analizar y exponer las teorías, los enfoques teóricos, las investigaciones y los antecedentes en general que se consideren válidos para el encuadre del estudio” Esto implica en teoría la finalización del sitio web implicando varias etapas, desde las pruebas constantes, la entrega final junto a los soportes post-lanzamiento que aseguran que el sitio web sea funcional, vistoso y que cumplan con lo que requiere la institución.</w:t>
+      </w:r>
+    </w:p>
+    <w:p>
+      <w:pPr>
+        <w:spacing w:line="360" w:lineRule="auto"/>
         <w:jc w:val="both"/>
         <w:rPr>
           <w:rFonts w:ascii="Arial" w:eastAsia="Times New Roman" w:hAnsi="Arial" w:cs="Arial"/>
@@ -14831,75 +13850,11 @@
       </w:pPr>
       <w:r>
         <w:rPr>
-          <w:rFonts w:ascii="Arial" w:eastAsia="Times New Roman" w:hAnsi="Arial" w:cs="Arial"/>
-          <w:color w:val="000000"/>
-          <w:sz w:val="24"/>
-          <w:szCs w:val="24"/>
-          <w:lang w:eastAsia="es-VE"/>
-        </w:rPr>
-        <w:t xml:space="preserve">      Esto implica una perspicacia que lleva a cabo un análisis cuidadoso y sistemático tomando decisiones más informadas, A partir de aquí se determina la creación de un sitio web institucional desde su planificación hasta su publicación, sobre todo porque es muy importante definir sus objetivos claros, desde la creación para la interfaz adecuada, diseñar una estructura visualmente agradable a la vista, realizar un contenido de calidad con respecto al público que va dirigido, optimizar el sitio para dispositivos móviles y muy importante que se realicen pruebas exhaustivas para el correcto funcionamiento de la página.</w:t>
-      </w:r>
-    </w:p>
-    <w:p>
-      <w:pPr>
-        <w:spacing w:line="360" w:lineRule="auto"/>
-        <w:jc w:val="both"/>
-        <w:rPr>
-          <w:rFonts w:ascii="Arial" w:eastAsia="Times New Roman" w:hAnsi="Arial" w:cs="Arial"/>
-          <w:color w:val="000000"/>
-          <w:sz w:val="24"/>
-          <w:szCs w:val="24"/>
-          <w:lang w:eastAsia="es-VE"/>
-        </w:rPr>
-      </w:pPr>
-      <w:r>
-        <w:rPr>
-          <w:rFonts w:ascii="Arial" w:eastAsia="Times New Roman" w:hAnsi="Arial" w:cs="Arial"/>
-          <w:color w:val="000000"/>
-          <w:sz w:val="24"/>
-          <w:szCs w:val="24"/>
-          <w:lang w:eastAsia="es-VE"/>
-        </w:rPr>
-        <w:t xml:space="preserve">     El marco teórico según “Hernández Sampieri” (2003) “Es el sustento teórico del estudio. Implica analizar y exponer las teorías, los enfoques teóricos, las investigaciones y los antecedentes en general que se consideren válidos para el encuadre del estudio” Esto implica en teoría la finalización del sitio web implicando varias etapas, desde las pruebas constantes, la entrega final junto a los soportes post-lanzamiento que aseguran que el sitio web sea funcional, vistoso y que cumplan con lo que requiere la institución.</w:t>
-      </w:r>
-    </w:p>
-    <w:p>
-      <w:pPr>
-        <w:spacing w:line="360" w:lineRule="auto"/>
-        <w:jc w:val="both"/>
-        <w:rPr>
-          <w:rFonts w:ascii="Arial" w:eastAsia="Times New Roman" w:hAnsi="Arial" w:cs="Arial"/>
-          <w:color w:val="000000"/>
-          <w:sz w:val="24"/>
-          <w:szCs w:val="24"/>
-          <w:lang w:eastAsia="es-VE"/>
-        </w:rPr>
-      </w:pPr>
-      <w:r>
-        <w:rPr>
-          <w:rFonts w:ascii="Arial" w:hAnsi="Arial" w:cs="Arial"/>
-          <w:sz w:val="24"/>
-          <w:szCs w:val="24"/>
-        </w:rPr>
-        <w:t xml:space="preserve">     De cara para afrontar la construcción y desarrollo del software estuvo implicada la metodología espiral. Según Roger </w:t>
-      </w:r>
-      <w:proofErr w:type="spellStart"/>
-      <w:r>
-        <w:rPr>
-          <w:rFonts w:ascii="Arial" w:hAnsi="Arial" w:cs="Arial"/>
-          <w:sz w:val="24"/>
-          <w:szCs w:val="24"/>
-        </w:rPr>
-        <w:t>Pressman</w:t>
-      </w:r>
-      <w:proofErr w:type="spellEnd"/>
-      <w:r>
-        <w:rPr>
-          <w:rFonts w:ascii="Arial" w:hAnsi="Arial" w:cs="Arial"/>
-          <w:sz w:val="24"/>
-          <w:szCs w:val="24"/>
-        </w:rPr>
-        <w:t xml:space="preserve"> (2</w:t>
+          <w:rFonts w:ascii="Arial" w:hAnsi="Arial" w:cs="Arial"/>
+          <w:sz w:val="24"/>
+          <w:szCs w:val="24"/>
+        </w:rPr>
+        <w:t xml:space="preserve">     De cara para afrontar la construcción y desarrollo del software estuvo implicada la metodología espiral. Según Roger Pressman (2</w:t>
       </w:r>
       <w:r>
         <w:rPr>
@@ -14908,27 +13863,7 @@
           <w:szCs w:val="24"/>
           <w:lang w:val="es-ES"/>
         </w:rPr>
-        <w:t xml:space="preserve">010) “Es un modelo de proceso evolutivo que se enfoca en la entrega incremental de productos a través de repeticiones cíclicas. Este enfoque combina aspectos sistemáticos </w:t>
-      </w:r>
-      <w:proofErr w:type="gramStart"/>
-      <w:r>
-        <w:rPr>
-          <w:rFonts w:ascii="Arial" w:hAnsi="Arial" w:cs="Arial"/>
-          <w:sz w:val="24"/>
-          <w:szCs w:val="24"/>
-          <w:lang w:val="es-ES"/>
-        </w:rPr>
-        <w:t>del modelo cascada</w:t>
-      </w:r>
-      <w:proofErr w:type="gramEnd"/>
-      <w:r>
-        <w:rPr>
-          <w:rFonts w:ascii="Arial" w:hAnsi="Arial" w:cs="Arial"/>
-          <w:sz w:val="24"/>
-          <w:szCs w:val="24"/>
-          <w:lang w:val="es-ES"/>
-        </w:rPr>
-        <w:t xml:space="preserve">, con la naturaleza iterativa del desarrollo moderno, permitiendo incorporar retroalimentación constante y mejorar la calidad del producto. Cada ciclo incluye actividades como planificación, evaluación de riesgos, desarrollo y </w:t>
+        <w:t xml:space="preserve">010) “Es un modelo de proceso evolutivo que se enfoca en la entrega incremental de productos a través de repeticiones cíclicas. Este enfoque combina aspectos sistemáticos del modelo cascada, con la naturaleza iterativa del desarrollo moderno, permitiendo incorporar retroalimentación constante y mejorar la calidad del producto. Cada ciclo incluye actividades como planificación, evaluación de riesgos, desarrollo y </w:t>
       </w:r>
       <w:r>
         <w:rPr>
@@ -15007,25 +13942,7 @@
           <w:sz w:val="24"/>
           <w:szCs w:val="24"/>
         </w:rPr>
-        <w:t xml:space="preserve">Según Roger </w:t>
-      </w:r>
-      <w:proofErr w:type="spellStart"/>
-      <w:r>
-        <w:rPr>
-          <w:rFonts w:ascii="Arial" w:hAnsi="Arial" w:cs="Arial"/>
-          <w:sz w:val="24"/>
-          <w:szCs w:val="24"/>
-        </w:rPr>
-        <w:t>Pressman</w:t>
-      </w:r>
-      <w:proofErr w:type="spellEnd"/>
-      <w:r>
-        <w:rPr>
-          <w:rFonts w:ascii="Arial" w:hAnsi="Arial" w:cs="Arial"/>
-          <w:sz w:val="24"/>
-          <w:szCs w:val="24"/>
-        </w:rPr>
-        <w:t xml:space="preserve"> (2010) “La Metodología Espiral avanza a través de ciclos y espirales que se repiten continuamente hasta que el producto esté completo, ya que combina la naturaleza iterativa de modelos de cascada para desarrollar el software de forma incremental y gestionar riesgos.” Vienen siendo prácticas ortodoxas porque se desarrollan versiones incrementales del sitio, en los cuales se usan prototipos que reducen los riesgos, incorporando la retroalimentación del cliente, realizando pruebas exhaustivas del código y sus funcionalidades garantizando certezas, donde se evalúan los resultados y usa la retroalimentación para cada nuevo ciclo que corrijan errores o sumar nuevas funciones donde se repiten ciclos hasta finalizar la culminación de la página.</w:t>
+        <w:t>Según Roger Pressman (2010) “La Metodología Espiral avanza a través de ciclos y espirales que se repiten continuamente hasta que el producto esté completo, ya que combina la naturaleza iterativa de modelos de cascada para desarrollar el software de forma incremental y gestionar riesgos.” Vienen siendo prácticas ortodoxas porque se desarrollan versiones incrementales del sitio, en los cuales se usan prototipos que reducen los riesgos, incorporando la retroalimentación del cliente, realizando pruebas exhaustivas del código y sus funcionalidades garantizando certezas, donde se evalúan los resultados y usa la retroalimentación para cada nuevo ciclo que corrijan errores o sumar nuevas funciones donde se repiten ciclos hasta finalizar la culminación de la página.</w:t>
       </w:r>
     </w:p>
     <w:p>
@@ -15082,47 +13999,7 @@
           <w:szCs w:val="24"/>
           <w:lang w:val="es-ES"/>
         </w:rPr>
-        <w:t xml:space="preserve">Según Roger </w:t>
-      </w:r>
-      <w:proofErr w:type="spellStart"/>
-      <w:r>
-        <w:rPr>
-          <w:rFonts w:ascii="Arial" w:hAnsi="Arial" w:cs="Arial"/>
-          <w:sz w:val="24"/>
-          <w:szCs w:val="24"/>
-          <w:lang w:val="es-ES"/>
-        </w:rPr>
-        <w:t>Pressman</w:t>
-      </w:r>
-      <w:proofErr w:type="spellEnd"/>
-      <w:r>
-        <w:rPr>
-          <w:rFonts w:ascii="Arial" w:hAnsi="Arial" w:cs="Arial"/>
-          <w:sz w:val="24"/>
-          <w:szCs w:val="24"/>
-          <w:lang w:val="es-ES"/>
-        </w:rPr>
-        <w:t xml:space="preserve"> (2010), la importancia </w:t>
-      </w:r>
-      <w:proofErr w:type="spellStart"/>
-      <w:r>
-        <w:rPr>
-          <w:rFonts w:ascii="Arial" w:hAnsi="Arial" w:cs="Arial"/>
-          <w:sz w:val="24"/>
-          <w:szCs w:val="24"/>
-          <w:lang w:val="es-ES"/>
-        </w:rPr>
-        <w:t>critica</w:t>
-      </w:r>
-      <w:proofErr w:type="spellEnd"/>
-      <w:r>
-        <w:rPr>
-          <w:rFonts w:ascii="Arial" w:hAnsi="Arial" w:cs="Arial"/>
-          <w:sz w:val="24"/>
-          <w:szCs w:val="24"/>
-          <w:lang w:val="es-ES"/>
-        </w:rPr>
-        <w:t xml:space="preserve"> de la planificación inicial en el desarrollo del software. La planificación no es un mero formalismo, sino una actividad que sienta las bases como el éxito de un software.</w:t>
+        <w:t>Según Roger Pressman (2010), la importancia critica de la planificación inicial en el desarrollo del software. La planificación no es un mero formalismo, sino una actividad que sienta las bases como el éxito de un software.</w:t>
       </w:r>
     </w:p>
     <w:p>
@@ -15207,19 +14084,20 @@
           <w:szCs w:val="24"/>
           <w:lang w:val="es-ES"/>
         </w:rPr>
-        <w:t xml:space="preserve">Según Roger </w:t>
-      </w:r>
-      <w:proofErr w:type="spellStart"/>
-      <w:r>
+        <w:t xml:space="preserve">Según Roger Pressman (2010) “El análisis de requisitos es una de las etapas más cruciales y a menudo de las más desafiantes en el ciclo de vida del desarrollo del software, el autor considera que es la base sobre la cual se construye todo el proyecto, y los errores de esta fase pueden tener consecuencias en las etapas posteriores. </w:t>
+      </w:r>
+    </w:p>
+    <w:p>
+      <w:pPr>
+        <w:spacing w:line="360" w:lineRule="auto"/>
+        <w:jc w:val="both"/>
         <w:rPr>
           <w:rFonts w:ascii="Arial" w:hAnsi="Arial" w:cs="Arial"/>
           <w:sz w:val="24"/>
           <w:szCs w:val="24"/>
           <w:lang w:val="es-ES"/>
         </w:rPr>
-        <w:t>Pressman</w:t>
-      </w:r>
-      <w:proofErr w:type="spellEnd"/>
+      </w:pPr>
       <w:r>
         <w:rPr>
           <w:rFonts w:ascii="Arial" w:hAnsi="Arial" w:cs="Arial"/>
@@ -15227,7 +14105,67 @@
           <w:szCs w:val="24"/>
           <w:lang w:val="es-ES"/>
         </w:rPr>
-        <w:t xml:space="preserve"> (2010) “El análisis de requisitos es una de las etapas más cruciales y a menudo de las más desafiantes en el ciclo de vida del desarrollo del software, el autor considera que es la base sobre la cual se construye todo el proyecto, y los errores de esta fase pueden tener consecuencias en las etapas posteriores. </w:t>
+        <w:t xml:space="preserve">     Se cede a identificar las necesidades funcionales y no funcionales dentro de la institución, ya sea recolectando información mediante entrevistas, preguntas abiertas y cerradas, ver sus funciones clave (noticias, calendario académico, formulario de contacto, galería, secciones, buzón de sugerencias) Y analizar requerimientos legales (LOCTI, Ley de Protección de Datos, etc.)</w:t>
+      </w:r>
+    </w:p>
+    <w:p>
+      <w:pPr>
+        <w:spacing w:line="360" w:lineRule="auto"/>
+        <w:jc w:val="both"/>
+        <w:rPr>
+          <w:rFonts w:ascii="Arial" w:hAnsi="Arial" w:cs="Arial"/>
+          <w:b/>
+          <w:bCs/>
+          <w:sz w:val="24"/>
+          <w:szCs w:val="24"/>
+        </w:rPr>
+      </w:pPr>
+      <w:r>
+        <w:rPr>
+          <w:rFonts w:ascii="Arial" w:hAnsi="Arial" w:cs="Arial"/>
+          <w:sz w:val="24"/>
+          <w:szCs w:val="24"/>
+        </w:rPr>
+        <w:t xml:space="preserve"> </w:t>
+      </w:r>
+      <w:r>
+        <w:rPr>
+          <w:rFonts w:ascii="Arial" w:hAnsi="Arial" w:cs="Arial"/>
+          <w:b/>
+          <w:bCs/>
+          <w:sz w:val="24"/>
+          <w:szCs w:val="24"/>
+        </w:rPr>
+        <w:t>FASE III: DISEÑO</w:t>
+      </w:r>
+    </w:p>
+    <w:p>
+      <w:pPr>
+        <w:spacing w:line="360" w:lineRule="auto"/>
+        <w:jc w:val="both"/>
+        <w:rPr>
+          <w:rFonts w:ascii="Arial" w:hAnsi="Arial" w:cs="Arial"/>
+          <w:sz w:val="24"/>
+          <w:szCs w:val="24"/>
+        </w:rPr>
+      </w:pPr>
+      <w:r>
+        <w:rPr>
+          <w:rFonts w:ascii="Arial" w:hAnsi="Arial" w:cs="Arial"/>
+          <w:b/>
+          <w:bCs/>
+          <w:sz w:val="24"/>
+          <w:szCs w:val="24"/>
+        </w:rPr>
+        <w:t xml:space="preserve">     </w:t>
+      </w:r>
+      <w:r>
+        <w:rPr>
+          <w:rFonts w:ascii="Arial" w:hAnsi="Arial" w:cs="Arial"/>
+          <w:sz w:val="24"/>
+          <w:szCs w:val="24"/>
+        </w:rPr>
+        <w:t>Concreta Roger Pressman, el diseño es como el puente crucial entre los requisitos del cliente y la implementación final. Para Pressman, el diseño no es simplemente un paso, sino un conjunto de actividades de ingeniería que transforman los requisitos en un modelo completo y detallado que puede ser implementado.</w:t>
       </w:r>
     </w:p>
     <w:p>
@@ -15248,144 +14186,7 @@
           <w:szCs w:val="24"/>
           <w:lang w:val="es-ES"/>
         </w:rPr>
-        <w:t xml:space="preserve">     Se cede a identificar las necesidades funcionales y no funcionales dentro de la institución, ya sea recolectando información mediante entrevistas, preguntas abiertas y cerradas, ver sus funciones clave (noticias, calendario académico, formulario de contacto, galería, secciones, buzón de sugerencias) Y analizar requerimientos legales (LOCTI, Ley de Protección de Datos, etc.)</w:t>
-      </w:r>
-    </w:p>
-    <w:p>
-      <w:pPr>
-        <w:spacing w:line="360" w:lineRule="auto"/>
-        <w:jc w:val="both"/>
-        <w:rPr>
-          <w:rFonts w:ascii="Arial" w:hAnsi="Arial" w:cs="Arial"/>
-          <w:b/>
-          <w:bCs/>
-          <w:sz w:val="24"/>
-          <w:szCs w:val="24"/>
-        </w:rPr>
-      </w:pPr>
-      <w:r>
-        <w:rPr>
-          <w:rFonts w:ascii="Arial" w:hAnsi="Arial" w:cs="Arial"/>
-          <w:sz w:val="24"/>
-          <w:szCs w:val="24"/>
-        </w:rPr>
-        <w:t xml:space="preserve"> </w:t>
-      </w:r>
-      <w:r>
-        <w:rPr>
-          <w:rFonts w:ascii="Arial" w:hAnsi="Arial" w:cs="Arial"/>
-          <w:b/>
-          <w:bCs/>
-          <w:sz w:val="24"/>
-          <w:szCs w:val="24"/>
-        </w:rPr>
-        <w:t>FASE III: DISEÑO</w:t>
-      </w:r>
-    </w:p>
-    <w:p>
-      <w:pPr>
-        <w:spacing w:line="360" w:lineRule="auto"/>
-        <w:jc w:val="both"/>
-        <w:rPr>
-          <w:rFonts w:ascii="Arial" w:hAnsi="Arial" w:cs="Arial"/>
-          <w:sz w:val="24"/>
-          <w:szCs w:val="24"/>
-        </w:rPr>
-      </w:pPr>
-      <w:r>
-        <w:rPr>
-          <w:rFonts w:ascii="Arial" w:hAnsi="Arial" w:cs="Arial"/>
-          <w:b/>
-          <w:bCs/>
-          <w:sz w:val="24"/>
-          <w:szCs w:val="24"/>
-        </w:rPr>
-        <w:t xml:space="preserve">     </w:t>
-      </w:r>
-      <w:r>
-        <w:rPr>
-          <w:rFonts w:ascii="Arial" w:hAnsi="Arial" w:cs="Arial"/>
-          <w:sz w:val="24"/>
-          <w:szCs w:val="24"/>
-        </w:rPr>
-        <w:t xml:space="preserve">Concreta Roger </w:t>
-      </w:r>
-      <w:proofErr w:type="spellStart"/>
-      <w:r>
-        <w:rPr>
-          <w:rFonts w:ascii="Arial" w:hAnsi="Arial" w:cs="Arial"/>
-          <w:sz w:val="24"/>
-          <w:szCs w:val="24"/>
-        </w:rPr>
-        <w:t>Pressman</w:t>
-      </w:r>
-      <w:proofErr w:type="spellEnd"/>
-      <w:r>
-        <w:rPr>
-          <w:rFonts w:ascii="Arial" w:hAnsi="Arial" w:cs="Arial"/>
-          <w:sz w:val="24"/>
-          <w:szCs w:val="24"/>
-        </w:rPr>
-        <w:t xml:space="preserve">, el diseño es como el puente crucial entre los requisitos del cliente y la implementación final. Para </w:t>
-      </w:r>
-      <w:proofErr w:type="spellStart"/>
-      <w:r>
-        <w:rPr>
-          <w:rFonts w:ascii="Arial" w:hAnsi="Arial" w:cs="Arial"/>
-          <w:sz w:val="24"/>
-          <w:szCs w:val="24"/>
-        </w:rPr>
-        <w:t>Pressman</w:t>
-      </w:r>
-      <w:proofErr w:type="spellEnd"/>
-      <w:r>
-        <w:rPr>
-          <w:rFonts w:ascii="Arial" w:hAnsi="Arial" w:cs="Arial"/>
-          <w:sz w:val="24"/>
-          <w:szCs w:val="24"/>
-        </w:rPr>
-        <w:t>, el diseño no es simplemente un paso, sino un conjunto de actividades de ingeniería que transforman los requisitos en un modelo completo y detallado que puede ser implementado.</w:t>
-      </w:r>
-    </w:p>
-    <w:p>
-      <w:pPr>
-        <w:spacing w:line="360" w:lineRule="auto"/>
-        <w:jc w:val="both"/>
-        <w:rPr>
-          <w:rFonts w:ascii="Arial" w:hAnsi="Arial" w:cs="Arial"/>
-          <w:sz w:val="24"/>
-          <w:szCs w:val="24"/>
-          <w:lang w:val="es-ES"/>
-        </w:rPr>
-      </w:pPr>
-      <w:r>
-        <w:rPr>
-          <w:rFonts w:ascii="Arial" w:hAnsi="Arial" w:cs="Arial"/>
-          <w:sz w:val="24"/>
-          <w:szCs w:val="24"/>
-          <w:lang w:val="es-ES"/>
-        </w:rPr>
-        <w:t xml:space="preserve">     Se estructura la interfaz para la experiencia del usuario, basada en las creaciones de los bocetos (</w:t>
-      </w:r>
-      <w:proofErr w:type="spellStart"/>
-      <w:r>
-        <w:rPr>
-          <w:rFonts w:ascii="Arial" w:hAnsi="Arial" w:cs="Arial"/>
-          <w:sz w:val="24"/>
-          <w:szCs w:val="24"/>
-          <w:lang w:val="es-ES"/>
-        </w:rPr>
-        <w:t>wireframes</w:t>
-      </w:r>
-      <w:proofErr w:type="spellEnd"/>
-      <w:r>
-        <w:rPr>
-          <w:rFonts w:ascii="Arial" w:hAnsi="Arial" w:cs="Arial"/>
-          <w:sz w:val="24"/>
-          <w:szCs w:val="24"/>
-          <w:lang w:val="es-ES"/>
-        </w:rPr>
-        <w:t>) y mapas del sitio web. La elección de colores viene siendo crucial para la estética, usabilidad y emitir mensajes específicos a través de los colores (por ejemplo, celeste y azul) ya que se busca diseñar una navegación intuitiva, accesible y cómoda que sea atractiva y amigable para el usuario.</w:t>
+        <w:t xml:space="preserve">     Se estructura la interfaz para la experiencia del usuario, basada en las creaciones de los bocetos (wireframes) y mapas del sitio web. La elección de colores viene siendo crucial para la estética, usabilidad y emitir mensajes específicos a través de los colores (por ejemplo, celeste y azul) ya que se busca diseñar una navegación intuitiva, accesible y cómoda que sea atractiva y amigable para el usuario.</w:t>
       </w:r>
     </w:p>
     <w:p>
@@ -15554,27 +14355,7 @@
           <w:szCs w:val="24"/>
           <w:lang w:val="es-ES"/>
         </w:rPr>
-        <w:t xml:space="preserve">Cita </w:t>
-      </w:r>
-      <w:proofErr w:type="spellStart"/>
-      <w:r>
-        <w:rPr>
-          <w:rFonts w:ascii="Arial" w:hAnsi="Arial" w:cs="Arial"/>
-          <w:sz w:val="24"/>
-          <w:szCs w:val="24"/>
-          <w:lang w:val="es-ES"/>
-        </w:rPr>
-        <w:t>Pressman</w:t>
-      </w:r>
-      <w:proofErr w:type="spellEnd"/>
-      <w:r>
-        <w:rPr>
-          <w:rFonts w:ascii="Arial" w:hAnsi="Arial" w:cs="Arial"/>
-          <w:sz w:val="24"/>
-          <w:szCs w:val="24"/>
-          <w:lang w:val="es-ES"/>
-        </w:rPr>
-        <w:t xml:space="preserve"> qué, </w:t>
+        <w:t xml:space="preserve">Cita Pressman qué, </w:t>
       </w:r>
       <w:r>
         <w:rPr>
@@ -15601,43 +14382,7 @@
           <w:sz w:val="24"/>
           <w:szCs w:val="24"/>
         </w:rPr>
-        <w:t xml:space="preserve">     Se construye técnicamente la página web con la programación frontend (HTML y </w:t>
-      </w:r>
-      <w:proofErr w:type="spellStart"/>
-      <w:r>
-        <w:rPr>
-          <w:rFonts w:ascii="Arial" w:hAnsi="Arial" w:cs="Arial"/>
-          <w:sz w:val="24"/>
-          <w:szCs w:val="24"/>
-        </w:rPr>
-        <w:t>Javascript</w:t>
-      </w:r>
-      <w:proofErr w:type="spellEnd"/>
-      <w:r>
-        <w:rPr>
-          <w:rFonts w:ascii="Arial" w:hAnsi="Arial" w:cs="Arial"/>
-          <w:sz w:val="24"/>
-          <w:szCs w:val="24"/>
-        </w:rPr>
-        <w:t xml:space="preserve">), la configuración del </w:t>
-      </w:r>
-      <w:proofErr w:type="spellStart"/>
-      <w:r>
-        <w:rPr>
-          <w:rFonts w:ascii="Arial" w:hAnsi="Arial" w:cs="Arial"/>
-          <w:sz w:val="24"/>
-          <w:szCs w:val="24"/>
-        </w:rPr>
-        <w:t>backend</w:t>
-      </w:r>
-      <w:proofErr w:type="spellEnd"/>
-      <w:r>
-        <w:rPr>
-          <w:rFonts w:ascii="Arial" w:hAnsi="Arial" w:cs="Arial"/>
-          <w:sz w:val="24"/>
-          <w:szCs w:val="24"/>
-        </w:rPr>
-        <w:t xml:space="preserve"> se determina en cómo se almacena y acceden a los datos, refiriéndose a la forma en que se configura el lado del servidor de una aplicación o sitio web, determinando como se almacenan, se acceden los datos y las funciones del sitio, esta solo es imprescindible si hay formulario o base de datos, </w:t>
+        <w:t xml:space="preserve">     Se construye técnicamente la página web con la programación frontend (HTML y Javascript), la configuración del backend se determina en cómo se almacena y acceden a los datos, refiriéndose a la forma en que se configura el lado del servidor de una aplicación o sitio web, determinando como se almacenan, se acceden los datos y las funciones del sitio, esta solo es imprescindible si hay formulario o base de datos, </w:t>
       </w:r>
       <w:r>
         <w:rPr>
@@ -15703,64 +14448,67 @@
           <w:szCs w:val="24"/>
           <w:lang w:val="es-ES"/>
         </w:rPr>
-        <w:t xml:space="preserve">Según </w:t>
-      </w:r>
-      <w:proofErr w:type="spellStart"/>
-      <w:r>
-        <w:rPr>
-          <w:rFonts w:ascii="Arial" w:hAnsi="Arial" w:cs="Arial"/>
+        <w:t xml:space="preserve">Según Pressman, </w:t>
+      </w:r>
+      <w:r>
+        <w:rPr>
+          <w:rFonts w:ascii="Arial" w:hAnsi="Arial" w:cs="Arial"/>
+          <w:sz w:val="24"/>
+          <w:szCs w:val="24"/>
+        </w:rPr>
+        <w:t>concibe las pruebas como una actividad proactiva y esencial para el descubrimiento de errores y la validación de requisitos. La retroalimentación derivada de estas pruebas, así como de la interacción continua con los interesados, es el mecanismo que permite al equipo de desarrollo aprender, adaptarse y mejorar tanto el producto como el proceso de construcción del software.</w:t>
+      </w:r>
+    </w:p>
+    <w:p>
+      <w:pPr>
+        <w:spacing w:line="360" w:lineRule="auto"/>
+        <w:jc w:val="both"/>
+        <w:rPr>
+          <w:rFonts w:ascii="Arial" w:hAnsi="Arial" w:cs="Arial"/>
+          <w:sz w:val="24"/>
+          <w:szCs w:val="24"/>
+        </w:rPr>
+      </w:pPr>
+      <w:r>
+        <w:rPr>
+          <w:rFonts w:ascii="Arial" w:hAnsi="Arial" w:cs="Arial"/>
+          <w:sz w:val="24"/>
+          <w:szCs w:val="24"/>
+        </w:rPr>
+        <w:t xml:space="preserve">     Se verifica el funcionamiento del sitio y se reciben comentarios, las pruebas y la retroalimentación son cruciales para el desarrollo iterativo y la mejora continua del sitio web. Cada evaluación de esta se mide en pruebas funcionales como sus botones, enlaces y formularios y las pruebas de usabilidad que son metódicas para estimar la facilidad del uso del sitio, observando como los usuarios reales interactúan con ello para identificar problemas y dar marcha a las mejoras, fundamental para que el producto final sea intuitivo y satisfactorio para la experiencia del usuario.</w:t>
+      </w:r>
+    </w:p>
+    <w:p>
+      <w:pPr>
+        <w:spacing w:line="360" w:lineRule="auto"/>
+        <w:jc w:val="both"/>
+        <w:rPr>
+          <w:rFonts w:ascii="Arial" w:hAnsi="Arial" w:cs="Arial"/>
+          <w:b/>
+          <w:bCs/>
           <w:sz w:val="24"/>
           <w:szCs w:val="24"/>
           <w:lang w:val="es-ES"/>
         </w:rPr>
-        <w:t>Pressman</w:t>
-      </w:r>
-      <w:proofErr w:type="spellEnd"/>
-      <w:r>
-        <w:rPr>
-          <w:rFonts w:ascii="Arial" w:hAnsi="Arial" w:cs="Arial"/>
+      </w:pPr>
+      <w:r>
+        <w:rPr>
+          <w:rFonts w:ascii="Arial" w:hAnsi="Arial" w:cs="Arial"/>
+          <w:b/>
+          <w:bCs/>
           <w:sz w:val="24"/>
           <w:szCs w:val="24"/>
           <w:lang w:val="es-ES"/>
         </w:rPr>
-        <w:t xml:space="preserve">, </w:t>
-      </w:r>
-      <w:r>
-        <w:rPr>
-          <w:rFonts w:ascii="Arial" w:hAnsi="Arial" w:cs="Arial"/>
-          <w:sz w:val="24"/>
-          <w:szCs w:val="24"/>
-        </w:rPr>
-        <w:t>concibe las pruebas como una actividad proactiva y esencial para el descubrimiento de errores y la validación de requisitos. La retroalimentación derivada de estas pruebas, así como de la interacción continua con los interesados, es el mecanismo que permite al equipo de desarrollo aprender, adaptarse y mejorar tanto el producto como el proceso de construcción del software.</w:t>
-      </w:r>
-    </w:p>
-    <w:p>
-      <w:pPr>
-        <w:spacing w:line="360" w:lineRule="auto"/>
-        <w:jc w:val="both"/>
-        <w:rPr>
-          <w:rFonts w:ascii="Arial" w:hAnsi="Arial" w:cs="Arial"/>
-          <w:sz w:val="24"/>
-          <w:szCs w:val="24"/>
-        </w:rPr>
-      </w:pPr>
-      <w:r>
-        <w:rPr>
-          <w:rFonts w:ascii="Arial" w:hAnsi="Arial" w:cs="Arial"/>
-          <w:sz w:val="24"/>
-          <w:szCs w:val="24"/>
-        </w:rPr>
-        <w:t xml:space="preserve">     Se verifica el funcionamiento del sitio y se reciben comentarios, las pruebas y la retroalimentación son cruciales para el desarrollo iterativo y la mejora continua del sitio web. Cada evaluación de esta se mide en pruebas funcionales como sus botones, enlaces y formularios y las pruebas de usabilidad que son metódicas para estimar la facilidad del uso del sitio, observando como los usuarios reales interactúan con ello para identificar problemas y dar marcha a las mejoras, fundamental para que el producto final sea intuitivo y satisfactorio para la experiencia del usuario.</w:t>
-      </w:r>
-    </w:p>
-    <w:p>
-      <w:pPr>
-        <w:spacing w:line="360" w:lineRule="auto"/>
-        <w:jc w:val="both"/>
-        <w:rPr>
-          <w:rFonts w:ascii="Arial" w:hAnsi="Arial" w:cs="Arial"/>
-          <w:b/>
-          <w:bCs/>
+        <w:t>FASE VI: IMPLEMENTACIÓN</w:t>
+      </w:r>
+    </w:p>
+    <w:p>
+      <w:pPr>
+        <w:spacing w:line="360" w:lineRule="auto"/>
+        <w:jc w:val="both"/>
+        <w:rPr>
+          <w:rFonts w:ascii="Arial" w:hAnsi="Arial" w:cs="Arial"/>
           <w:sz w:val="24"/>
           <w:szCs w:val="24"/>
           <w:lang w:val="es-ES"/>
@@ -15775,32 +14523,45 @@
           <w:szCs w:val="24"/>
           <w:lang w:val="es-ES"/>
         </w:rPr>
-        <w:t>FASE VI: IMPLEMENTACIÓN</w:t>
-      </w:r>
-    </w:p>
-    <w:p>
-      <w:pPr>
-        <w:spacing w:line="360" w:lineRule="auto"/>
-        <w:jc w:val="both"/>
+        <w:t xml:space="preserve">     </w:t>
+      </w:r>
+      <w:r>
         <w:rPr>
           <w:rFonts w:ascii="Arial" w:hAnsi="Arial" w:cs="Arial"/>
           <w:sz w:val="24"/>
           <w:szCs w:val="24"/>
           <w:lang w:val="es-ES"/>
         </w:rPr>
-      </w:pPr>
-      <w:r>
-        <w:rPr>
-          <w:rFonts w:ascii="Arial" w:hAnsi="Arial" w:cs="Arial"/>
-          <w:b/>
-          <w:bCs/>
+        <w:t xml:space="preserve">Pressman la define como </w:t>
+      </w:r>
+      <w:r>
+        <w:rPr>
+          <w:rFonts w:ascii="Arial" w:hAnsi="Arial" w:cs="Arial"/>
+          <w:sz w:val="24"/>
+          <w:szCs w:val="24"/>
+        </w:rPr>
+        <w:t>una fase de construcción disciplinada que traduce los modelos abstractos en un producto funcional, donde la calidad del código, las pruebas unitarias, la gestión de la configuración y el refinamiento controlado del diseño son esenciales para el éxito del proyecto de software.</w:t>
+      </w:r>
+    </w:p>
+    <w:p>
+      <w:pPr>
+        <w:spacing w:line="360" w:lineRule="auto"/>
+        <w:jc w:val="both"/>
+        <w:rPr>
+          <w:rFonts w:ascii="Arial" w:hAnsi="Arial" w:cs="Arial"/>
           <w:sz w:val="24"/>
           <w:szCs w:val="24"/>
           <w:lang w:val="es-ES"/>
         </w:rPr>
-        <w:t xml:space="preserve">     </w:t>
-      </w:r>
-      <w:proofErr w:type="spellStart"/>
+      </w:pPr>
+      <w:r>
+        <w:rPr>
+          <w:rFonts w:ascii="Arial" w:hAnsi="Arial" w:cs="Arial"/>
+          <w:sz w:val="24"/>
+          <w:szCs w:val="24"/>
+        </w:rPr>
+        <w:t xml:space="preserve">     La implementación web es un pr</w:t>
+      </w:r>
       <w:r>
         <w:rPr>
           <w:rFonts w:ascii="Arial" w:hAnsi="Arial" w:cs="Arial"/>
@@ -15808,73 +14569,7 @@
           <w:szCs w:val="24"/>
           <w:lang w:val="es-ES"/>
         </w:rPr>
-        <w:t>Pressman</w:t>
-      </w:r>
-      <w:proofErr w:type="spellEnd"/>
-      <w:r>
-        <w:rPr>
-          <w:rFonts w:ascii="Arial" w:hAnsi="Arial" w:cs="Arial"/>
-          <w:sz w:val="24"/>
-          <w:szCs w:val="24"/>
-          <w:lang w:val="es-ES"/>
-        </w:rPr>
-        <w:t xml:space="preserve"> la define como </w:t>
-      </w:r>
-      <w:r>
-        <w:rPr>
-          <w:rFonts w:ascii="Arial" w:hAnsi="Arial" w:cs="Arial"/>
-          <w:sz w:val="24"/>
-          <w:szCs w:val="24"/>
-        </w:rPr>
-        <w:t>una fase de construcción disciplinada que traduce los modelos abstractos en un producto funcional, donde la calidad del código, las pruebas unitarias, la gestión de la configuración y el refinamiento controlado del diseño son esenciales para el éxito del proyecto de software.</w:t>
-      </w:r>
-    </w:p>
-    <w:p>
-      <w:pPr>
-        <w:spacing w:line="360" w:lineRule="auto"/>
-        <w:jc w:val="both"/>
-        <w:rPr>
-          <w:rFonts w:ascii="Arial" w:hAnsi="Arial" w:cs="Arial"/>
-          <w:sz w:val="24"/>
-          <w:szCs w:val="24"/>
-          <w:lang w:val="es-ES"/>
-        </w:rPr>
-      </w:pPr>
-      <w:r>
-        <w:rPr>
-          <w:rFonts w:ascii="Arial" w:hAnsi="Arial" w:cs="Arial"/>
-          <w:sz w:val="24"/>
-          <w:szCs w:val="24"/>
-        </w:rPr>
-        <w:t xml:space="preserve">     La implementación web es un </w:t>
-      </w:r>
-      <w:proofErr w:type="spellStart"/>
-      <w:r>
-        <w:rPr>
-          <w:rFonts w:ascii="Arial" w:hAnsi="Arial" w:cs="Arial"/>
-          <w:sz w:val="24"/>
-          <w:szCs w:val="24"/>
-        </w:rPr>
-        <w:t>pr</w:t>
-      </w:r>
-      <w:r>
-        <w:rPr>
-          <w:rFonts w:ascii="Arial" w:hAnsi="Arial" w:cs="Arial"/>
-          <w:sz w:val="24"/>
-          <w:szCs w:val="24"/>
-          <w:lang w:val="es-ES"/>
-        </w:rPr>
-        <w:t>oceso</w:t>
-      </w:r>
-      <w:proofErr w:type="spellEnd"/>
-      <w:r>
-        <w:rPr>
-          <w:rFonts w:ascii="Arial" w:hAnsi="Arial" w:cs="Arial"/>
-          <w:sz w:val="24"/>
-          <w:szCs w:val="24"/>
-          <w:lang w:val="es-ES"/>
-        </w:rPr>
-        <w:t xml:space="preserve"> indispensable que se pone en marcha un proceso desde su desarrollo hasta su puesta en producción, es muy relevante ya que se hace accesible a través del servidor web. Este proceso está involucrado en diferentes etapas como la organización de archivos, subir al servidor o hosting institucional, capacitar al personal para actualizar contenidos, la promoción del sitio entre la comunidad </w:t>
+        <w:t xml:space="preserve">oceso indispensable que se pone en marcha un proceso desde su desarrollo hasta su puesta en producción, es muy relevante ya que se hace accesible a través del servidor web. Este proceso está involucrado en diferentes etapas como la organización de archivos, subir al servidor o hosting institucional, capacitar al personal para actualizar contenidos, la promoción del sitio entre la comunidad </w:t>
       </w:r>
       <w:r>
         <w:rPr>
@@ -15930,27 +14625,7 @@
           <w:szCs w:val="24"/>
           <w:lang w:val="es-ES"/>
         </w:rPr>
-        <w:t xml:space="preserve">     </w:t>
-      </w:r>
-      <w:proofErr w:type="spellStart"/>
-      <w:r>
-        <w:rPr>
-          <w:rFonts w:ascii="Arial" w:hAnsi="Arial" w:cs="Arial"/>
-          <w:sz w:val="24"/>
-          <w:szCs w:val="24"/>
-          <w:lang w:val="es-ES"/>
-        </w:rPr>
-        <w:t>Pressman</w:t>
-      </w:r>
-      <w:proofErr w:type="spellEnd"/>
-      <w:r>
-        <w:rPr>
-          <w:rFonts w:ascii="Arial" w:hAnsi="Arial" w:cs="Arial"/>
-          <w:sz w:val="24"/>
-          <w:szCs w:val="24"/>
-          <w:lang w:val="es-ES"/>
-        </w:rPr>
-        <w:t xml:space="preserve"> culmina </w:t>
+        <w:t xml:space="preserve">     Pressman culmina </w:t>
       </w:r>
       <w:r>
         <w:rPr>
@@ -16153,25 +14828,7 @@
           <w:sz w:val="24"/>
           <w:szCs w:val="24"/>
         </w:rPr>
-        <w:t xml:space="preserve">     Según Oscar Jara </w:t>
-      </w:r>
-      <w:proofErr w:type="spellStart"/>
-      <w:r>
-        <w:rPr>
-          <w:rFonts w:ascii="Arial" w:hAnsi="Arial" w:cs="Arial"/>
-          <w:sz w:val="24"/>
-          <w:szCs w:val="24"/>
-        </w:rPr>
-        <w:t>Holliday</w:t>
-      </w:r>
-      <w:proofErr w:type="spellEnd"/>
-      <w:r>
-        <w:rPr>
-          <w:rFonts w:ascii="Arial" w:hAnsi="Arial" w:cs="Arial"/>
-          <w:sz w:val="24"/>
-          <w:szCs w:val="24"/>
-        </w:rPr>
-        <w:t xml:space="preserve"> (2018) </w:t>
+        <w:t xml:space="preserve">     Según Oscar Jara Holliday (2018) </w:t>
       </w:r>
       <w:r>
         <w:rPr>
@@ -16416,27 +15073,7 @@
           <w:sz w:val="24"/>
           <w:szCs w:val="24"/>
         </w:rPr>
-        <w:t xml:space="preserve">La Fase de Diseño tiene como objetivo fundamental conceptualizar y estructurar la Dirección Web de Retroalimentación, asegurando que su arquitectura y experiencia de usuario (UX/UI) estén estratégicamente enfocadas en erradicar la desinformación mediante la centralización de la comunicación verificada. Se busca documentar formalmente los requisitos para los módulos de respuestas </w:t>
-      </w:r>
-      <w:proofErr w:type="spellStart"/>
-      <w:r>
-        <w:rPr>
-          <w:rFonts w:ascii="Arial" w:hAnsi="Arial" w:cs="Arial"/>
-          <w:bCs/>
-          <w:sz w:val="24"/>
-          <w:szCs w:val="24"/>
-        </w:rPr>
-        <w:t>veríficadas</w:t>
-      </w:r>
-      <w:proofErr w:type="spellEnd"/>
-      <w:r>
-        <w:rPr>
-          <w:rFonts w:ascii="Arial" w:hAnsi="Arial" w:cs="Arial"/>
-          <w:bCs/>
-          <w:sz w:val="24"/>
-          <w:szCs w:val="24"/>
-        </w:rPr>
-        <w:t xml:space="preserve"> y el sistema de moderación, asegurando que la plataforma esté técnicamente preparada para gestionar y responder la desinformación de manera proactiva y reactiva.</w:t>
+        <w:t>La Fase de Diseño tiene como objetivo fundamental conceptualizar y estructurar la Dirección Web de Retroalimentación, asegurando que su arquitectura y experiencia de usuario (UX/UI) estén estratégicamente enfocadas en erradicar la desinformación mediante la centralización de la comunicación verificada. Se busca documentar formalmente los requisitos para los módulos de respuestas veríficadas y el sistema de moderación, asegurando que la plataforma esté técnicamente preparada para gestionar y responder la desinformación de manera proactiva y reactiva.</w:t>
       </w:r>
     </w:p>
     <w:p>
@@ -16710,25 +15347,7 @@
           <w:sz w:val="24"/>
           <w:szCs w:val="24"/>
         </w:rPr>
-        <w:t xml:space="preserve">Unidad Educativa Estatal Amelia </w:t>
-      </w:r>
-      <w:proofErr w:type="spellStart"/>
-      <w:r>
-        <w:rPr>
-          <w:rFonts w:ascii="Arial" w:hAnsi="Arial" w:cs="Arial"/>
-          <w:sz w:val="24"/>
-          <w:szCs w:val="24"/>
-        </w:rPr>
-        <w:t>Rios</w:t>
-      </w:r>
-      <w:proofErr w:type="spellEnd"/>
-      <w:r>
-        <w:rPr>
-          <w:rFonts w:ascii="Arial" w:hAnsi="Arial" w:cs="Arial"/>
-          <w:sz w:val="24"/>
-          <w:szCs w:val="24"/>
-        </w:rPr>
-        <w:t>, proporcionando instrucciones claras para navegar</w:t>
+        <w:t>Unidad Educativa Estatal Amelia Rios, proporcionando instrucciones claras para navegar</w:t>
       </w:r>
       <w:r>
         <w:rPr>
@@ -18518,25 +17137,7 @@
           <w:sz w:val="24"/>
           <w:szCs w:val="24"/>
         </w:rPr>
-        <w:t xml:space="preserve">2 Utilizar preferiblemente navegadores actualizados (Chrome, Firefox, </w:t>
-      </w:r>
-      <w:proofErr w:type="spellStart"/>
-      <w:r>
-        <w:rPr>
-          <w:rFonts w:ascii="Arial" w:hAnsi="Arial" w:cs="Arial"/>
-          <w:sz w:val="24"/>
-          <w:szCs w:val="24"/>
-        </w:rPr>
-        <w:t>Edge</w:t>
-      </w:r>
-      <w:proofErr w:type="spellEnd"/>
-      <w:r>
-        <w:rPr>
-          <w:rFonts w:ascii="Arial" w:hAnsi="Arial" w:cs="Arial"/>
-          <w:sz w:val="24"/>
-          <w:szCs w:val="24"/>
-        </w:rPr>
-        <w:t>).</w:t>
+        <w:t>2 Utilizar preferiblemente navegadores actualizados (Chrome, Firefox, Edge).</w:t>
       </w:r>
     </w:p>
     <w:p>
@@ -18847,43 +17448,7 @@
           <w:sz w:val="24"/>
           <w:szCs w:val="24"/>
         </w:rPr>
-        <w:t xml:space="preserve">Fundamenta Alfredo </w:t>
-      </w:r>
-      <w:proofErr w:type="spellStart"/>
-      <w:r>
-        <w:rPr>
-          <w:rFonts w:ascii="Arial" w:hAnsi="Arial" w:cs="Arial"/>
-          <w:sz w:val="24"/>
-          <w:szCs w:val="24"/>
-        </w:rPr>
-        <w:t>Ghiso</w:t>
-      </w:r>
-      <w:proofErr w:type="spellEnd"/>
-      <w:r>
-        <w:rPr>
-          <w:rFonts w:ascii="Arial" w:hAnsi="Arial" w:cs="Arial"/>
-          <w:sz w:val="24"/>
-          <w:szCs w:val="24"/>
-        </w:rPr>
-        <w:t xml:space="preserve"> (2011) "La sistematización es un proceso constructivo y dialógico que busca acrecentar la capacidad de los sujetos de una práctica para que, a través de la reflexión, puedan construir nuevas lecturas, nuevos sentidos sobre esa práctica y reorientar la acción futura." El autor no solo se centra en la necesidad de consolidar un paradigma investigativo propio y alternativo que desafíe el modelo positivista y sirva explícitamente a la emancipación y al cambio social. ha trabajado la idea de que la sistematización es una "construcción colectiva de conocimientos sobre el quehacer, orientada a extraer aprendizajes, compartirlos y cualificarlos" "Alfredo </w:t>
-      </w:r>
-      <w:proofErr w:type="spellStart"/>
-      <w:r>
-        <w:rPr>
-          <w:rFonts w:ascii="Arial" w:hAnsi="Arial" w:cs="Arial"/>
-          <w:sz w:val="24"/>
-          <w:szCs w:val="24"/>
-        </w:rPr>
-        <w:t>Ghiso</w:t>
-      </w:r>
-      <w:proofErr w:type="spellEnd"/>
-      <w:r>
-        <w:rPr>
-          <w:rFonts w:ascii="Arial" w:hAnsi="Arial" w:cs="Arial"/>
-          <w:sz w:val="24"/>
-          <w:szCs w:val="24"/>
-        </w:rPr>
-        <w:t>" (2011), lo que subraya el objetivo final de cualificar (transformar positivamente) la práctica.</w:t>
+        <w:t>Fundamenta Alfredo Ghiso (2011) "La sistematización es un proceso constructivo y dialógico que busca acrecentar la capacidad de los sujetos de una práctica para que, a través de la reflexión, puedan construir nuevas lecturas, nuevos sentidos sobre esa práctica y reorientar la acción futura." El autor no solo se centra en la necesidad de consolidar un paradigma investigativo propio y alternativo que desafíe el modelo positivista y sirva explícitamente a la emancipación y al cambio social. ha trabajado la idea de que la sistematización es una "construcción colectiva de conocimientos sobre el quehacer, orientada a extraer aprendizajes, compartirlos y cualificarlos" "Alfredo Ghiso" (2011), lo que subraya el objetivo final de cualificar (transformar positivamente) la práctica.</w:t>
       </w:r>
     </w:p>
     <w:p>
@@ -20240,7 +18805,7 @@
         <w:noProof/>
         <w:lang w:val="es-ES"/>
       </w:rPr>
-      <w:t>8</w:t>
+      <w:t>10</w:t>
     </w:r>
     <w:r>
       <w:fldChar w:fldCharType="end"/>
@@ -23850,7 +22415,7 @@
 </file>
 
 <file path=customXml/itemProps1.xml><?xml version="1.0" encoding="utf-8"?>
-<ds:datastoreItem xmlns:ds="http://schemas.openxmlformats.org/officeDocument/2006/customXml" ds:itemID="{4EABDDB0-9D25-421B-BA6F-8CFD55819502}">
+<ds:datastoreItem xmlns:ds="http://schemas.openxmlformats.org/officeDocument/2006/customXml" ds:itemID="{7BB68608-EC32-4DFD-8A43-976B904B3638}">
   <ds:schemaRefs>
     <ds:schemaRef ds:uri="http://schemas.openxmlformats.org/officeDocument/2006/bibliography"/>
   </ds:schemaRefs>

</xml_diff>